<commit_message>
Remove Supported Family References section; add one-time folder migration requirement (FR-5.5)
Co-authored-by: Copilot <223556219+Copilot@users.noreply.github.com>
</commit_message>
<xml_diff>
--- a/IPCorrespondence/Vertex IP FDD - Avanade Formatted.docx
+++ b/IPCorrespondence/Vertex IP FDD - Avanade Formatted.docx
@@ -6791,7 +6791,15 @@
             <w:tcW w:w="4873" w:type="dxa"/>
           </w:tcPr>
           <w:p>
+            <w:pPr>
+              <w:rPr>
+                <w:strike/>
+              </w:rPr>
+            </w:pPr>
             <w:r>
+              <w:rPr>
+                <w:strike/>
+              </w:rPr>
               <w:t>FR-2.2</w:t>
             </w:r>
           </w:p>
@@ -6803,8 +6811,14 @@
           <w:p>
             <w:pPr>
               <w:cnfStyle w:val="000000010000" w:firstRow="0" w:lastRow="0" w:firstColumn="0" w:lastColumn="0" w:oddVBand="0" w:evenVBand="0" w:oddHBand="0" w:evenHBand="1" w:firstRowFirstColumn="0" w:firstRowLastColumn="0" w:lastRowFirstColumn="0" w:lastRowLastColumn="0"/>
+              <w:rPr>
+                <w:strike/>
+              </w:rPr>
             </w:pPr>
             <w:r>
+              <w:rPr>
+                <w:strike/>
+              </w:rPr>
               <w:t>If no reference is found in the subject or current body, the agent shall inspect the most recent quoted correspondence in the thread.</w:t>
             </w:r>
           </w:p>
@@ -6868,7 +6882,23 @@
               <w:cnfStyle w:val="000000010000" w:firstRow="0" w:lastRow="0" w:firstColumn="0" w:lastColumn="0" w:oddVBand="0" w:evenVBand="0" w:oddHBand="0" w:evenHBand="1" w:firstRowFirstColumn="0" w:firstRowLastColumn="0" w:lastRowFirstColumn="0" w:lastRowLastColumn="0"/>
             </w:pPr>
             <w:r>
-              <w:t>The agent shall support the current known matter prefixes (VPI, ALP, EXO, MOD, SEM, VIA, VMN), subject to confirmation with Vertex IP Operations; new prefixes require a change request.</w:t>
+              <w:t xml:space="preserve">The agent shall support the current known matter prefixes </w:t>
+            </w:r>
+            <w:commentRangeStart w:id="19"/>
+            <w:r>
+              <w:t>(VPI, ALP, EXO, MOD, SEM, VIA, VMN</w:t>
+            </w:r>
+            <w:commentRangeEnd w:id="19"/>
+            <w:r>
+              <w:rPr>
+                <w:rStyle w:val="CommentReference"/>
+                <w:sz w:val="21"/>
+                <w:szCs w:val="22"/>
+              </w:rPr>
+              <w:commentReference w:id="19"/>
+            </w:r>
+            <w:r>
+              <w:t>), subject to confirmation with Vertex IP Operations; new prefixes require a change request.</w:t>
             </w:r>
           </w:p>
         </w:tc>
@@ -6878,11 +6908,11 @@
       <w:pPr>
         <w:pStyle w:val="Heading2"/>
       </w:pPr>
-      <w:bookmarkStart w:id="19" w:name="_Toc242351046"/>
+      <w:bookmarkStart w:id="20" w:name="_Toc242351046"/>
       <w:r>
         <w:t>FR-3 — Reference Normalization</w:t>
       </w:r>
-      <w:bookmarkEnd w:id="19"/>
+      <w:bookmarkEnd w:id="20"/>
     </w:p>
     <w:tbl>
       <w:tblPr>
@@ -6957,11 +6987,11 @@
       <w:pPr>
         <w:pStyle w:val="Heading2"/>
       </w:pPr>
-      <w:bookmarkStart w:id="20" w:name="_Toc242351047"/>
+      <w:bookmarkStart w:id="21" w:name="_Toc242351047"/>
       <w:r>
         <w:t>FR-4 — Folder Rule Validation</w:t>
       </w:r>
-      <w:bookmarkEnd w:id="20"/>
+      <w:bookmarkEnd w:id="21"/>
     </w:p>
     <w:tbl>
       <w:tblPr>
@@ -7123,11 +7153,11 @@
       <w:pPr>
         <w:pStyle w:val="Heading2"/>
       </w:pPr>
-      <w:bookmarkStart w:id="21" w:name="_Toc242351048"/>
+      <w:bookmarkStart w:id="22" w:name="_Toc242351048"/>
       <w:r>
         <w:t>FR-5 — Folder Management</w:t>
       </w:r>
-      <w:bookmarkEnd w:id="21"/>
+      <w:bookmarkEnd w:id="22"/>
     </w:p>
     <w:tbl>
       <w:tblPr>
@@ -7294,11 +7324,11 @@
       <w:pPr>
         <w:pStyle w:val="Heading2"/>
       </w:pPr>
-      <w:bookmarkStart w:id="22" w:name="_Toc242351049"/>
+      <w:bookmarkStart w:id="23" w:name="_Toc242351049"/>
       <w:r>
         <w:t>FR-6 — Automated Filing Rules</w:t>
       </w:r>
-      <w:bookmarkEnd w:id="22"/>
+      <w:bookmarkEnd w:id="23"/>
     </w:p>
     <w:tbl>
       <w:tblPr>
@@ -7431,11 +7461,11 @@
       <w:pPr>
         <w:pStyle w:val="Heading2"/>
       </w:pPr>
-      <w:bookmarkStart w:id="23" w:name="_Toc242351050"/>
+      <w:bookmarkStart w:id="24" w:name="_Toc242351050"/>
       <w:r>
         <w:t>FR-7 — Exception Handling</w:t>
       </w:r>
-      <w:bookmarkEnd w:id="23"/>
+      <w:bookmarkEnd w:id="24"/>
     </w:p>
     <w:tbl>
       <w:tblPr>
@@ -7659,12 +7689,12 @@
       <w:pPr>
         <w:pStyle w:val="Heading2"/>
       </w:pPr>
-      <w:bookmarkStart w:id="24" w:name="_Toc242351051"/>
+      <w:bookmarkStart w:id="25" w:name="_Toc242351051"/>
       <w:r>
         <w:lastRenderedPageBreak/>
         <w:t>FR-8 — Audit Logging</w:t>
       </w:r>
-      <w:bookmarkEnd w:id="24"/>
+      <w:bookmarkEnd w:id="25"/>
     </w:p>
     <w:tbl>
       <w:tblPr>
@@ -7739,11 +7769,11 @@
       <w:pPr>
         <w:pStyle w:val="Heading2"/>
       </w:pPr>
-      <w:bookmarkStart w:id="25" w:name="_Toc242351052"/>
+      <w:bookmarkStart w:id="26" w:name="_Toc242351052"/>
       <w:r>
         <w:t>FR-9 — Daily Reporting</w:t>
       </w:r>
-      <w:bookmarkEnd w:id="25"/>
+      <w:bookmarkEnd w:id="26"/>
     </w:p>
     <w:tbl>
       <w:tblPr>
@@ -7963,21 +7993,21 @@
       <w:pPr>
         <w:pStyle w:val="Heading1"/>
       </w:pPr>
-      <w:bookmarkStart w:id="26" w:name="_Toc242351053"/>
+      <w:bookmarkStart w:id="27" w:name="_Toc242351053"/>
       <w:r>
         <w:t>6. Reference Identification</w:t>
       </w:r>
-      <w:bookmarkEnd w:id="26"/>
+      <w:bookmarkEnd w:id="27"/>
     </w:p>
     <w:p>
       <w:pPr>
         <w:pStyle w:val="Heading2"/>
       </w:pPr>
-      <w:bookmarkStart w:id="27" w:name="_Toc242351054"/>
+      <w:bookmarkStart w:id="28" w:name="_Toc242351054"/>
       <w:r>
         <w:t>Supported Family References</w:t>
       </w:r>
-      <w:bookmarkEnd w:id="27"/>
+      <w:bookmarkEnd w:id="28"/>
     </w:p>
     <w:p>
       <w:r>
@@ -8142,11 +8172,11 @@
       <w:pPr>
         <w:pStyle w:val="Heading2"/>
       </w:pPr>
-      <w:bookmarkStart w:id="28" w:name="_Toc242351055"/>
+      <w:bookmarkStart w:id="29" w:name="_Toc242351055"/>
       <w:r>
         <w:t>Reference Search Order</w:t>
       </w:r>
-      <w:bookmarkEnd w:id="28"/>
+      <w:bookmarkEnd w:id="29"/>
     </w:p>
     <w:p>
       <w:r>
@@ -8157,11 +8187,11 @@
       <w:pPr>
         <w:pStyle w:val="Heading3"/>
       </w:pPr>
-      <w:bookmarkStart w:id="29" w:name="_Toc242351056"/>
+      <w:bookmarkStart w:id="30" w:name="_Toc242351056"/>
       <w:r>
         <w:t>Priority 1</w:t>
       </w:r>
-      <w:bookmarkEnd w:id="29"/>
+      <w:bookmarkEnd w:id="30"/>
     </w:p>
     <w:p>
       <w:r>
@@ -8218,11 +8248,11 @@
       <w:pPr>
         <w:pStyle w:val="Heading3"/>
       </w:pPr>
-      <w:bookmarkStart w:id="30" w:name="_Toc242351057"/>
+      <w:bookmarkStart w:id="31" w:name="_Toc242351057"/>
       <w:r>
         <w:t>Priority 2</w:t>
       </w:r>
-      <w:bookmarkEnd w:id="30"/>
+      <w:bookmarkEnd w:id="31"/>
     </w:p>
     <w:p>
       <w:r>
@@ -8279,11 +8309,11 @@
       <w:pPr>
         <w:pStyle w:val="Heading3"/>
       </w:pPr>
-      <w:bookmarkStart w:id="31" w:name="_Toc242351058"/>
+      <w:bookmarkStart w:id="32" w:name="_Toc242351058"/>
       <w:r>
         <w:t>Priority 3</w:t>
       </w:r>
-      <w:bookmarkEnd w:id="31"/>
+      <w:bookmarkEnd w:id="32"/>
     </w:p>
     <w:p>
       <w:r>
@@ -8320,12 +8350,12 @@
       <w:pPr>
         <w:pStyle w:val="Heading1"/>
       </w:pPr>
-      <w:bookmarkStart w:id="32" w:name="_Toc242351059"/>
+      <w:bookmarkStart w:id="33" w:name="_Toc242351059"/>
       <w:r>
         <w:lastRenderedPageBreak/>
         <w:t>7. Reference Normalization</w:t>
       </w:r>
-      <w:bookmarkEnd w:id="32"/>
+      <w:bookmarkEnd w:id="33"/>
     </w:p>
     <w:p>
       <w:r>
@@ -8336,11 +8366,11 @@
       <w:pPr>
         <w:pStyle w:val="Heading2"/>
       </w:pPr>
-      <w:bookmarkStart w:id="33" w:name="_Toc242351060"/>
+      <w:bookmarkStart w:id="34" w:name="_Toc242351060"/>
       <w:r>
         <w:t>Examples</w:t>
       </w:r>
-      <w:bookmarkEnd w:id="33"/>
+      <w:bookmarkEnd w:id="34"/>
     </w:p>
     <w:tbl>
       <w:tblPr>
@@ -8627,11 +8657,11 @@
       <w:pPr>
         <w:pStyle w:val="Heading2"/>
       </w:pPr>
-      <w:bookmarkStart w:id="34" w:name="_Toc242351061"/>
+      <w:bookmarkStart w:id="35" w:name="_Toc242351061"/>
       <w:r>
         <w:t>Normalization Rules</w:t>
       </w:r>
-      <w:bookmarkEnd w:id="34"/>
+      <w:bookmarkEnd w:id="35"/>
     </w:p>
     <w:p>
       <w:pPr>
@@ -8685,21 +8715,21 @@
       <w:pPr>
         <w:pStyle w:val="Heading1"/>
       </w:pPr>
-      <w:bookmarkStart w:id="35" w:name="_Toc242351062"/>
+      <w:bookmarkStart w:id="36" w:name="_Toc242351062"/>
       <w:r>
         <w:t>8. Folder Structure</w:t>
       </w:r>
-      <w:bookmarkEnd w:id="35"/>
+      <w:bookmarkEnd w:id="36"/>
     </w:p>
     <w:p>
       <w:pPr>
         <w:pStyle w:val="Heading2"/>
       </w:pPr>
-      <w:bookmarkStart w:id="36" w:name="_Toc242351063"/>
+      <w:bookmarkStart w:id="37" w:name="_Toc242351063"/>
       <w:r>
         <w:t>Expected Folder Architecture</w:t>
       </w:r>
-      <w:bookmarkEnd w:id="36"/>
+      <w:bookmarkEnd w:id="37"/>
     </w:p>
     <w:tbl>
       <w:tblPr>
@@ -8904,21 +8934,21 @@
       <w:pPr>
         <w:pStyle w:val="Heading1"/>
       </w:pPr>
-      <w:bookmarkStart w:id="37" w:name="_Toc242351064"/>
+      <w:bookmarkStart w:id="38" w:name="_Toc242351064"/>
       <w:r>
         <w:t>9. Automated Filing Rules</w:t>
       </w:r>
-      <w:bookmarkEnd w:id="37"/>
+      <w:bookmarkEnd w:id="38"/>
     </w:p>
     <w:p>
       <w:pPr>
         <w:pStyle w:val="Heading2"/>
       </w:pPr>
-      <w:bookmarkStart w:id="38" w:name="_Toc242351065"/>
+      <w:bookmarkStart w:id="39" w:name="_Toc242351065"/>
       <w:r>
         <w:t>Rule 1 – Single Valid Family</w:t>
       </w:r>
-      <w:bookmarkEnd w:id="38"/>
+      <w:bookmarkEnd w:id="39"/>
     </w:p>
     <w:p>
       <w:pPr>
@@ -9016,11 +9046,11 @@
       <w:pPr>
         <w:pStyle w:val="Heading2"/>
       </w:pPr>
-      <w:bookmarkStart w:id="39" w:name="_Toc242351066"/>
+      <w:bookmarkStart w:id="40" w:name="_Toc242351066"/>
       <w:r>
         <w:t>Rule 2 – Folder Exists</w:t>
       </w:r>
-      <w:bookmarkEnd w:id="39"/>
+      <w:bookmarkEnd w:id="40"/>
     </w:p>
     <w:p>
       <w:pPr>
@@ -9118,11 +9148,11 @@
       <w:pPr>
         <w:pStyle w:val="Heading2"/>
       </w:pPr>
-      <w:bookmarkStart w:id="40" w:name="_Toc242351067"/>
+      <w:bookmarkStart w:id="41" w:name="_Toc242351067"/>
       <w:r>
         <w:t>Rule 3 – Folder Missing</w:t>
       </w:r>
-      <w:bookmarkEnd w:id="40"/>
+      <w:bookmarkEnd w:id="41"/>
     </w:p>
     <w:p>
       <w:pPr>
@@ -9264,21 +9294,21 @@
       <w:pPr>
         <w:pStyle w:val="Heading1"/>
       </w:pPr>
-      <w:bookmarkStart w:id="41" w:name="_Toc242351068"/>
+      <w:bookmarkStart w:id="42" w:name="_Toc242351068"/>
       <w:r>
         <w:t>10. Exception Rules</w:t>
       </w:r>
-      <w:bookmarkEnd w:id="41"/>
+      <w:bookmarkEnd w:id="42"/>
     </w:p>
     <w:p>
       <w:pPr>
         <w:pStyle w:val="Heading2"/>
       </w:pPr>
-      <w:bookmarkStart w:id="42" w:name="_Toc242351069"/>
+      <w:bookmarkStart w:id="43" w:name="_Toc242351069"/>
       <w:r>
         <w:t>Exception 1 – No Reference Found</w:t>
       </w:r>
-      <w:bookmarkEnd w:id="42"/>
+      <w:bookmarkEnd w:id="43"/>
     </w:p>
     <w:p>
       <w:pPr>
@@ -9363,11 +9393,11 @@
       <w:pPr>
         <w:pStyle w:val="Heading2"/>
       </w:pPr>
-      <w:bookmarkStart w:id="43" w:name="_Toc242351070"/>
+      <w:bookmarkStart w:id="44" w:name="_Toc242351070"/>
       <w:r>
         <w:t>Exception 2 – Multiple Family References</w:t>
       </w:r>
-      <w:bookmarkEnd w:id="43"/>
+      <w:bookmarkEnd w:id="44"/>
     </w:p>
     <w:p>
       <w:pPr>
@@ -9443,11 +9473,11 @@
       <w:pPr>
         <w:pStyle w:val="Heading2"/>
       </w:pPr>
-      <w:bookmarkStart w:id="44" w:name="_Toc242351071"/>
+      <w:bookmarkStart w:id="45" w:name="_Toc242351071"/>
       <w:r>
         <w:t>Exception 3 – Subject/Body Conflict</w:t>
       </w:r>
-      <w:bookmarkEnd w:id="44"/>
+      <w:bookmarkEnd w:id="45"/>
     </w:p>
     <w:p>
       <w:pPr>
@@ -9577,11 +9607,11 @@
       <w:pPr>
         <w:pStyle w:val="Heading2"/>
       </w:pPr>
-      <w:bookmarkStart w:id="45" w:name="_Toc242351072"/>
+      <w:bookmarkStart w:id="46" w:name="_Toc242351072"/>
       <w:r>
         <w:t>Exception 4 – Conflicting References in Quoted History</w:t>
       </w:r>
-      <w:bookmarkEnd w:id="45"/>
+      <w:bookmarkEnd w:id="46"/>
     </w:p>
     <w:p>
       <w:pPr>
@@ -9695,11 +9725,11 @@
       <w:pPr>
         <w:pStyle w:val="Heading2"/>
       </w:pPr>
-      <w:bookmarkStart w:id="46" w:name="_Toc242351073"/>
+      <w:bookmarkStart w:id="47" w:name="_Toc242351073"/>
       <w:r>
         <w:t>Exception 5 – Folder Rule Validation Failure (Invalid Format)</w:t>
       </w:r>
-      <w:bookmarkEnd w:id="46"/>
+      <w:bookmarkEnd w:id="47"/>
     </w:p>
     <w:p>
       <w:pPr>
@@ -9810,11 +9840,11 @@
       <w:pPr>
         <w:pStyle w:val="Heading2"/>
       </w:pPr>
-      <w:bookmarkStart w:id="47" w:name="_Toc242351074"/>
+      <w:bookmarkStart w:id="48" w:name="_Toc242351074"/>
       <w:r>
         <w:t>Exception 6 – Attachment Only</w:t>
       </w:r>
-      <w:bookmarkEnd w:id="47"/>
+      <w:bookmarkEnd w:id="48"/>
     </w:p>
     <w:p>
       <w:pPr>
@@ -9857,11 +9887,11 @@
       <w:pPr>
         <w:pStyle w:val="Heading1"/>
       </w:pPr>
-      <w:bookmarkStart w:id="48" w:name="_Toc242351075"/>
+      <w:bookmarkStart w:id="49" w:name="_Toc242351075"/>
       <w:r>
         <w:t>11. Folder Creation Process</w:t>
       </w:r>
-      <w:bookmarkEnd w:id="48"/>
+      <w:bookmarkEnd w:id="49"/>
     </w:p>
     <w:p>
       <w:r>
@@ -9872,11 +9902,11 @@
       <w:pPr>
         <w:pStyle w:val="Heading3"/>
       </w:pPr>
-      <w:bookmarkStart w:id="49" w:name="_Toc242351076"/>
+      <w:bookmarkStart w:id="50" w:name="_Toc242351076"/>
       <w:r>
         <w:t>Step 1</w:t>
       </w:r>
-      <w:bookmarkEnd w:id="49"/>
+      <w:bookmarkEnd w:id="50"/>
     </w:p>
     <w:p>
       <w:r>
@@ -9933,11 +9963,11 @@
       <w:pPr>
         <w:pStyle w:val="Heading3"/>
       </w:pPr>
-      <w:bookmarkStart w:id="50" w:name="_Toc242351077"/>
+      <w:bookmarkStart w:id="51" w:name="_Toc242351077"/>
       <w:r>
         <w:t>Step 2</w:t>
       </w:r>
-      <w:bookmarkEnd w:id="50"/>
+      <w:bookmarkEnd w:id="51"/>
     </w:p>
     <w:p>
       <w:r>
@@ -9948,11 +9978,11 @@
       <w:pPr>
         <w:pStyle w:val="Heading3"/>
       </w:pPr>
-      <w:bookmarkStart w:id="51" w:name="_Toc242351078"/>
+      <w:bookmarkStart w:id="52" w:name="_Toc242351078"/>
       <w:r>
         <w:t>Step 3</w:t>
       </w:r>
-      <w:bookmarkEnd w:id="51"/>
+      <w:bookmarkEnd w:id="52"/>
     </w:p>
     <w:p>
       <w:r>
@@ -9963,11 +9993,11 @@
       <w:pPr>
         <w:pStyle w:val="Heading3"/>
       </w:pPr>
-      <w:bookmarkStart w:id="52" w:name="_Toc242351079"/>
+      <w:bookmarkStart w:id="53" w:name="_Toc242351079"/>
       <w:r>
         <w:t>Step 4</w:t>
       </w:r>
-      <w:bookmarkEnd w:id="52"/>
+      <w:bookmarkEnd w:id="53"/>
     </w:p>
     <w:p>
       <w:r>
@@ -9978,11 +10008,11 @@
       <w:pPr>
         <w:pStyle w:val="Heading1"/>
       </w:pPr>
-      <w:bookmarkStart w:id="53" w:name="_Toc242351080"/>
+      <w:bookmarkStart w:id="54" w:name="_Toc242351080"/>
       <w:r>
         <w:t>12. Audit Logging</w:t>
       </w:r>
-      <w:bookmarkEnd w:id="53"/>
+      <w:bookmarkEnd w:id="54"/>
     </w:p>
     <w:p>
       <w:r>
@@ -9993,12 +10023,12 @@
       <w:pPr>
         <w:pStyle w:val="Heading2"/>
       </w:pPr>
-      <w:bookmarkStart w:id="54" w:name="_Toc242351081"/>
+      <w:bookmarkStart w:id="55" w:name="_Toc242351081"/>
       <w:r>
         <w:lastRenderedPageBreak/>
         <w:t>Audit Fields</w:t>
       </w:r>
-      <w:bookmarkEnd w:id="54"/>
+      <w:bookmarkEnd w:id="55"/>
     </w:p>
     <w:tbl>
       <w:tblPr>
@@ -10284,21 +10314,21 @@
       <w:pPr>
         <w:pStyle w:val="Heading1"/>
       </w:pPr>
-      <w:bookmarkStart w:id="55" w:name="_Toc242351082"/>
+      <w:bookmarkStart w:id="56" w:name="_Toc242351082"/>
       <w:r>
         <w:t>13. Daily Report Functional Design</w:t>
       </w:r>
-      <w:bookmarkEnd w:id="55"/>
+      <w:bookmarkEnd w:id="56"/>
     </w:p>
     <w:p>
       <w:pPr>
         <w:pStyle w:val="Heading2"/>
       </w:pPr>
-      <w:bookmarkStart w:id="56" w:name="_Toc242351083"/>
+      <w:bookmarkStart w:id="57" w:name="_Toc242351083"/>
       <w:r>
         <w:t>Report Schedule</w:t>
       </w:r>
-      <w:bookmarkEnd w:id="56"/>
+      <w:bookmarkEnd w:id="57"/>
     </w:p>
     <w:p>
       <w:r>
@@ -10360,11 +10390,11 @@
       <w:pPr>
         <w:pStyle w:val="Heading3"/>
       </w:pPr>
-      <w:bookmarkStart w:id="57" w:name="_Toc242351084"/>
+      <w:bookmarkStart w:id="58" w:name="_Toc242351084"/>
       <w:r>
         <w:t>Executive Summary</w:t>
       </w:r>
-      <w:bookmarkEnd w:id="57"/>
+      <w:bookmarkEnd w:id="58"/>
     </w:p>
     <w:tbl>
       <w:tblPr>
@@ -10549,11 +10579,11 @@
       <w:pPr>
         <w:pStyle w:val="Heading3"/>
       </w:pPr>
-      <w:bookmarkStart w:id="58" w:name="_Toc242351085"/>
+      <w:bookmarkStart w:id="59" w:name="_Toc242351085"/>
       <w:r>
         <w:t>New Folders Created</w:t>
       </w:r>
-      <w:bookmarkEnd w:id="58"/>
+      <w:bookmarkEnd w:id="59"/>
     </w:p>
     <w:tbl>
       <w:tblPr>
@@ -10653,11 +10683,11 @@
       <w:pPr>
         <w:pStyle w:val="Heading3"/>
       </w:pPr>
-      <w:bookmarkStart w:id="59" w:name="_Toc242351086"/>
+      <w:bookmarkStart w:id="60" w:name="_Toc242351086"/>
       <w:r>
         <w:t>Filing Activity</w:t>
       </w:r>
-      <w:bookmarkEnd w:id="59"/>
+      <w:bookmarkEnd w:id="60"/>
     </w:p>
     <w:tbl>
       <w:tblPr>
@@ -10805,11 +10835,11 @@
       <w:pPr>
         <w:pStyle w:val="Heading3"/>
       </w:pPr>
-      <w:bookmarkStart w:id="60" w:name="_Toc242351087"/>
+      <w:bookmarkStart w:id="61" w:name="_Toc242351087"/>
       <w:r>
         <w:t>Exceptions</w:t>
       </w:r>
-      <w:bookmarkEnd w:id="60"/>
+      <w:bookmarkEnd w:id="61"/>
     </w:p>
     <w:tbl>
       <w:tblPr>
@@ -10957,11 +10987,11 @@
       <w:pPr>
         <w:pStyle w:val="Heading3"/>
       </w:pPr>
-      <w:bookmarkStart w:id="61" w:name="_Toc242351088"/>
+      <w:bookmarkStart w:id="62" w:name="_Toc242351088"/>
       <w:r>
         <w:t>Normalization Activity</w:t>
       </w:r>
-      <w:bookmarkEnd w:id="61"/>
+      <w:bookmarkEnd w:id="62"/>
     </w:p>
     <w:tbl>
       <w:tblPr>
@@ -11061,21 +11091,21 @@
       <w:pPr>
         <w:pStyle w:val="Heading1"/>
       </w:pPr>
-      <w:bookmarkStart w:id="62" w:name="_Toc242351089"/>
+      <w:bookmarkStart w:id="63" w:name="_Toc242351089"/>
       <w:r>
         <w:t>14. Non-Functional Requirements</w:t>
       </w:r>
-      <w:bookmarkEnd w:id="62"/>
+      <w:bookmarkEnd w:id="63"/>
     </w:p>
     <w:p>
       <w:pPr>
         <w:pStyle w:val="Heading2"/>
       </w:pPr>
-      <w:bookmarkStart w:id="63" w:name="_Toc242351090"/>
+      <w:bookmarkStart w:id="64" w:name="_Toc242351090"/>
       <w:r>
         <w:t>Performance</w:t>
       </w:r>
-      <w:bookmarkEnd w:id="63"/>
+      <w:bookmarkEnd w:id="64"/>
     </w:p>
     <w:p>
       <w:pPr>
@@ -11089,11 +11119,11 @@
       <w:pPr>
         <w:pStyle w:val="Heading2"/>
       </w:pPr>
-      <w:bookmarkStart w:id="64" w:name="_Toc242351091"/>
+      <w:bookmarkStart w:id="65" w:name="_Toc242351091"/>
       <w:r>
         <w:t>Accuracy</w:t>
       </w:r>
-      <w:bookmarkEnd w:id="64"/>
+      <w:bookmarkEnd w:id="65"/>
     </w:p>
     <w:p>
       <w:pPr>
@@ -11107,11 +11137,11 @@
       <w:pPr>
         <w:pStyle w:val="Heading2"/>
       </w:pPr>
-      <w:bookmarkStart w:id="65" w:name="_Toc242351092"/>
+      <w:bookmarkStart w:id="66" w:name="_Toc242351092"/>
       <w:r>
         <w:t>Security</w:t>
       </w:r>
-      <w:bookmarkEnd w:id="65"/>
+      <w:bookmarkEnd w:id="66"/>
     </w:p>
     <w:p>
       <w:pPr>
@@ -11125,12 +11155,12 @@
       <w:pPr>
         <w:pStyle w:val="Heading2"/>
       </w:pPr>
-      <w:bookmarkStart w:id="66" w:name="_Toc242351093"/>
+      <w:bookmarkStart w:id="67" w:name="_Toc242351093"/>
       <w:r>
         <w:lastRenderedPageBreak/>
         <w:t>Auditability</w:t>
       </w:r>
-      <w:bookmarkEnd w:id="66"/>
+      <w:bookmarkEnd w:id="67"/>
     </w:p>
     <w:p>
       <w:pPr>
@@ -11144,11 +11174,11 @@
       <w:pPr>
         <w:pStyle w:val="Heading2"/>
       </w:pPr>
-      <w:bookmarkStart w:id="67" w:name="_Toc242351094"/>
+      <w:bookmarkStart w:id="68" w:name="_Toc242351094"/>
       <w:r>
         <w:t>Scalability</w:t>
       </w:r>
-      <w:bookmarkEnd w:id="67"/>
+      <w:bookmarkEnd w:id="68"/>
     </w:p>
     <w:p>
       <w:pPr>
@@ -11162,11 +11192,11 @@
       <w:pPr>
         <w:pStyle w:val="Heading1"/>
       </w:pPr>
-      <w:bookmarkStart w:id="68" w:name="_Toc242351095"/>
+      <w:bookmarkStart w:id="69" w:name="_Toc242351095"/>
       <w:r>
         <w:t>15. Future Phase Enhancements</w:t>
       </w:r>
-      <w:bookmarkEnd w:id="68"/>
+      <w:bookmarkEnd w:id="69"/>
     </w:p>
     <w:p>
       <w:r>
@@ -11187,11 +11217,11 @@
       <w:pPr>
         <w:pStyle w:val="Heading3"/>
       </w:pPr>
-      <w:bookmarkStart w:id="69" w:name="_Toc242351096"/>
+      <w:bookmarkStart w:id="70" w:name="_Toc242351096"/>
       <w:r>
         <w:t>Attachment Processing</w:t>
       </w:r>
-      <w:bookmarkEnd w:id="69"/>
+      <w:bookmarkEnd w:id="70"/>
     </w:p>
     <w:p>
       <w:pPr>
@@ -11221,11 +11251,11 @@
       <w:pPr>
         <w:pStyle w:val="Heading3"/>
       </w:pPr>
-      <w:bookmarkStart w:id="70" w:name="_Toc242351097"/>
+      <w:bookmarkStart w:id="71" w:name="_Toc242351097"/>
       <w:r>
         <w:t>Copilot Studio Agent</w:t>
       </w:r>
-      <w:bookmarkEnd w:id="70"/>
+      <w:bookmarkEnd w:id="71"/>
     </w:p>
     <w:p>
       <w:r>
@@ -11268,11 +11298,11 @@
       <w:pPr>
         <w:pStyle w:val="Heading3"/>
       </w:pPr>
-      <w:bookmarkStart w:id="71" w:name="_Toc242351098"/>
+      <w:bookmarkStart w:id="72" w:name="_Toc242351098"/>
       <w:r>
         <w:t>Power BI Dashboard</w:t>
       </w:r>
-      <w:bookmarkEnd w:id="71"/>
+      <w:bookmarkEnd w:id="72"/>
     </w:p>
     <w:p>
       <w:r>
@@ -11323,11 +11353,11 @@
       <w:pPr>
         <w:pStyle w:val="Heading1"/>
       </w:pPr>
-      <w:bookmarkStart w:id="72" w:name="_Toc242351099"/>
+      <w:bookmarkStart w:id="73" w:name="_Toc242351099"/>
       <w:r>
         <w:t>Appendix – Proposed Business Decisions</w:t>
       </w:r>
-      <w:bookmarkEnd w:id="72"/>
+      <w:bookmarkEnd w:id="73"/>
     </w:p>
     <w:tbl>
       <w:tblPr>
@@ -11926,8 +11956,8 @@
       </w:r>
     </w:p>
     <w:sectPr>
-      <w:headerReference w:type="default" r:id="rId10"/>
-      <w:footerReference w:type="default" r:id="rId11"/>
+      <w:headerReference w:type="default" r:id="rId14"/>
+      <w:footerReference w:type="default" r:id="rId15"/>
       <w:pgSz w:w="12240" w:h="15840"/>
       <w:pgMar w:top="1134" w:right="1247" w:bottom="1134" w:left="1247" w:header="720" w:footer="720" w:gutter="0"/>
       <w:cols w:space="720"/>
@@ -11935,6 +11965,45 @@
     </w:sectPr>
   </w:body>
 </w:document>
+</file>
+
+<file path=word/comments.xml><?xml version="1.0" encoding="utf-8"?>
+<w:comments xmlns:wpc="http://schemas.microsoft.com/office/word/2010/wordprocessingCanvas" xmlns:cx="http://schemas.microsoft.com/office/drawing/2014/chartex" xmlns:cx1="http://schemas.microsoft.com/office/drawing/2015/9/8/chartex" xmlns:cx2="http://schemas.microsoft.com/office/drawing/2015/10/21/chartex" xmlns:cx3="http://schemas.microsoft.com/office/drawing/2016/5/9/chartex" xmlns:cx4="http://schemas.microsoft.com/office/drawing/2016/5/10/chartex" xmlns:cx5="http://schemas.microsoft.com/office/drawing/2016/5/11/chartex" xmlns:cx6="http://schemas.microsoft.com/office/drawing/2016/5/12/chartex" xmlns:cx7="http://schemas.microsoft.com/office/drawing/2016/5/13/chartex" xmlns:cx8="http://schemas.microsoft.com/office/drawing/2016/5/14/chartex" xmlns:mc="http://schemas.openxmlformats.org/markup-compatibility/2006" xmlns:aink="http://schemas.microsoft.com/office/drawing/2016/ink" xmlns:am3d="http://schemas.microsoft.com/office/drawing/2017/model3d" xmlns:o="urn:schemas-microsoft-com:office:office" xmlns:oel="http://schemas.microsoft.com/office/2019/extlst" xmlns:r="http://schemas.openxmlformats.org/officeDocument/2006/relationships" xmlns:m="http://schemas.openxmlformats.org/officeDocument/2006/math" xmlns:v="urn:schemas-microsoft-com:vml" xmlns:wp14="http://schemas.microsoft.com/office/word/2010/wordprocessingDrawing" xmlns:wp="http://schemas.openxmlformats.org/drawingml/2006/wordprocessingDrawing" xmlns:w10="urn:schemas-microsoft-com:office:word" xmlns:w="http://schemas.openxmlformats.org/wordprocessingml/2006/main" xmlns:w14="http://schemas.microsoft.com/office/word/2010/wordml" xmlns:w15="http://schemas.microsoft.com/office/word/2012/wordml" xmlns:w16cex="http://schemas.microsoft.com/office/word/2018/wordml/cex" xmlns:w16cid="http://schemas.microsoft.com/office/word/2016/wordml/cid" xmlns:w16="http://schemas.microsoft.com/office/word/2018/wordml" xmlns:w16du="http://schemas.microsoft.com/office/word/2023/wordml/word16du" xmlns:w16sdtdh="http://schemas.microsoft.com/office/word/2020/wordml/sdtdatahash" xmlns:w16sdtfl="http://schemas.microsoft.com/office/word/2024/wordml/sdtformatlock" xmlns:w16se="http://schemas.microsoft.com/office/word/2015/wordml/symex" xmlns:wpg="http://schemas.microsoft.com/office/word/2010/wordprocessingGroup" xmlns:wpi="http://schemas.microsoft.com/office/word/2010/wordprocessingInk" xmlns:wne="http://schemas.microsoft.com/office/word/2006/wordml" xmlns:wps="http://schemas.microsoft.com/office/word/2010/wordprocessingShape" mc:Ignorable="w14 w15 w16se w16cid w16 w16cex w16sdtdh w16sdtfl w16du wp14">
+  <w:comment w:id="19" w:author="Hai Nguyen" w:date="2026-10-12T11:03:00Z" w:initials="HN">
+    <w:p>
+      <w:pPr>
+        <w:pStyle w:val="CommentText"/>
+      </w:pPr>
+      <w:r>
+        <w:rPr>
+          <w:rStyle w:val="CommentReference"/>
+        </w:rPr>
+        <w:annotationRef/>
+      </w:r>
+      <w:r>
+        <w:t>Prefix - segment - segment</w:t>
+      </w:r>
+    </w:p>
+  </w:comment>
+</w:comments>
+</file>
+
+<file path=word/commentsExtended.xml><?xml version="1.0" encoding="utf-8"?>
+<w15:commentsEx xmlns:wpc="http://schemas.microsoft.com/office/word/2010/wordprocessingCanvas" xmlns:cx="http://schemas.microsoft.com/office/drawing/2014/chartex" xmlns:cx1="http://schemas.microsoft.com/office/drawing/2015/9/8/chartex" xmlns:cx2="http://schemas.microsoft.com/office/drawing/2015/10/21/chartex" xmlns:cx3="http://schemas.microsoft.com/office/drawing/2016/5/9/chartex" xmlns:cx4="http://schemas.microsoft.com/office/drawing/2016/5/10/chartex" xmlns:cx5="http://schemas.microsoft.com/office/drawing/2016/5/11/chartex" xmlns:cx6="http://schemas.microsoft.com/office/drawing/2016/5/12/chartex" xmlns:cx7="http://schemas.microsoft.com/office/drawing/2016/5/13/chartex" xmlns:cx8="http://schemas.microsoft.com/office/drawing/2016/5/14/chartex" xmlns:mc="http://schemas.openxmlformats.org/markup-compatibility/2006" xmlns:aink="http://schemas.microsoft.com/office/drawing/2016/ink" xmlns:am3d="http://schemas.microsoft.com/office/drawing/2017/model3d" xmlns:o="urn:schemas-microsoft-com:office:office" xmlns:oel="http://schemas.microsoft.com/office/2019/extlst" xmlns:r="http://schemas.openxmlformats.org/officeDocument/2006/relationships" xmlns:m="http://schemas.openxmlformats.org/officeDocument/2006/math" xmlns:v="urn:schemas-microsoft-com:vml" xmlns:wp14="http://schemas.microsoft.com/office/word/2010/wordprocessingDrawing" xmlns:wp="http://schemas.openxmlformats.org/drawingml/2006/wordprocessingDrawing" xmlns:w10="urn:schemas-microsoft-com:office:word" xmlns:w="http://schemas.openxmlformats.org/wordprocessingml/2006/main" xmlns:w14="http://schemas.microsoft.com/office/word/2010/wordml" xmlns:w15="http://schemas.microsoft.com/office/word/2012/wordml" xmlns:w16cex="http://schemas.microsoft.com/office/word/2018/wordml/cex" xmlns:w16cid="http://schemas.microsoft.com/office/word/2016/wordml/cid" xmlns:w16="http://schemas.microsoft.com/office/word/2018/wordml" xmlns:w16du="http://schemas.microsoft.com/office/word/2023/wordml/word16du" xmlns:w16sdtdh="http://schemas.microsoft.com/office/word/2020/wordml/sdtdatahash" xmlns:w16sdtfl="http://schemas.microsoft.com/office/word/2024/wordml/sdtformatlock" xmlns:w16se="http://schemas.microsoft.com/office/word/2015/wordml/symex" xmlns:wpg="http://schemas.microsoft.com/office/word/2010/wordprocessingGroup" xmlns:wpi="http://schemas.microsoft.com/office/word/2010/wordprocessingInk" xmlns:wne="http://schemas.microsoft.com/office/word/2006/wordml" xmlns:wps="http://schemas.microsoft.com/office/word/2010/wordprocessingShape" mc:Ignorable="w14 w15 w16se w16cid w16 w16cex w16sdtdh w16sdtfl w16du wp14">
+  <w15:commentEx w15:paraId="7AB035E5" w15:done="0"/>
+</w15:commentsEx>
+</file>
+
+<file path=word/commentsExtensible.xml><?xml version="1.0" encoding="utf-8"?>
+<w16cex:commentsExtensible xmlns:wpc="http://schemas.microsoft.com/office/word/2010/wordprocessingCanvas" xmlns:cx="http://schemas.microsoft.com/office/drawing/2014/chartex" xmlns:cx1="http://schemas.microsoft.com/office/drawing/2015/9/8/chartex" xmlns:cx2="http://schemas.microsoft.com/office/drawing/2015/10/21/chartex" xmlns:cx3="http://schemas.microsoft.com/office/drawing/2016/5/9/chartex" xmlns:cx4="http://schemas.microsoft.com/office/drawing/2016/5/10/chartex" xmlns:cx5="http://schemas.microsoft.com/office/drawing/2016/5/11/chartex" xmlns:cx6="http://schemas.microsoft.com/office/drawing/2016/5/12/chartex" xmlns:cx7="http://schemas.microsoft.com/office/drawing/2016/5/13/chartex" xmlns:cx8="http://schemas.microsoft.com/office/drawing/2016/5/14/chartex" xmlns:cr="http://schemas.microsoft.com/office/comments/2020/reactions" xmlns:mc="http://schemas.openxmlformats.org/markup-compatibility/2006" xmlns:aink="http://schemas.microsoft.com/office/drawing/2016/ink" xmlns:am3d="http://schemas.microsoft.com/office/drawing/2017/model3d" xmlns:o="urn:schemas-microsoft-com:office:office" xmlns:oel="http://schemas.microsoft.com/office/2019/extlst" xmlns:r="http://schemas.openxmlformats.org/officeDocument/2006/relationships" xmlns:m="http://schemas.openxmlformats.org/officeDocument/2006/math" xmlns:v="urn:schemas-microsoft-com:vml" xmlns:wp14="http://schemas.microsoft.com/office/word/2010/wordprocessingDrawing" xmlns:wp="http://schemas.openxmlformats.org/drawingml/2006/wordprocessingDrawing" xmlns:w10="urn:schemas-microsoft-com:office:word" xmlns:w="http://schemas.openxmlformats.org/wordprocessingml/2006/main" xmlns:w14="http://schemas.microsoft.com/office/word/2010/wordml" xmlns:w15="http://schemas.microsoft.com/office/word/2012/wordml" xmlns:w16cex="http://schemas.microsoft.com/office/word/2018/wordml/cex" xmlns:w16cid="http://schemas.microsoft.com/office/word/2016/wordml/cid" xmlns:w16="http://schemas.microsoft.com/office/word/2018/wordml" xmlns:w16du="http://schemas.microsoft.com/office/word/2023/wordml/word16du" xmlns:w16sdtdh="http://schemas.microsoft.com/office/word/2020/wordml/sdtdatahash" xmlns:w16sdtfl="http://schemas.microsoft.com/office/word/2024/wordml/sdtformatlock" xmlns:w16se="http://schemas.microsoft.com/office/word/2015/wordml/symex" xmlns:wpg="http://schemas.microsoft.com/office/word/2010/wordprocessingGroup" xmlns:wpi="http://schemas.microsoft.com/office/word/2010/wordprocessingInk" xmlns:wne="http://schemas.microsoft.com/office/word/2006/wordml" xmlns:wps="http://schemas.microsoft.com/office/word/2010/wordprocessingShape" mc:Ignorable="w14 w15 w16se w16cid w16 w16cex w16sdtdh w16sdtfl cr w16du wp14">
+  <w16cex:commentExtensible w16cex:durableId="76570689" w16cex:dateUtc="2026-10-12T16:03:00Z"/>
+</w16cex:commentsExtensible>
+</file>
+
+<file path=word/commentsIds.xml><?xml version="1.0" encoding="utf-8"?>
+<w16cid:commentsIds xmlns:wpc="http://schemas.microsoft.com/office/word/2010/wordprocessingCanvas" xmlns:cx="http://schemas.microsoft.com/office/drawing/2014/chartex" xmlns:cx1="http://schemas.microsoft.com/office/drawing/2015/9/8/chartex" xmlns:cx2="http://schemas.microsoft.com/office/drawing/2015/10/21/chartex" xmlns:cx3="http://schemas.microsoft.com/office/drawing/2016/5/9/chartex" xmlns:cx4="http://schemas.microsoft.com/office/drawing/2016/5/10/chartex" xmlns:cx5="http://schemas.microsoft.com/office/drawing/2016/5/11/chartex" xmlns:cx6="http://schemas.microsoft.com/office/drawing/2016/5/12/chartex" xmlns:cx7="http://schemas.microsoft.com/office/drawing/2016/5/13/chartex" xmlns:cx8="http://schemas.microsoft.com/office/drawing/2016/5/14/chartex" xmlns:mc="http://schemas.openxmlformats.org/markup-compatibility/2006" xmlns:aink="http://schemas.microsoft.com/office/drawing/2016/ink" xmlns:am3d="http://schemas.microsoft.com/office/drawing/2017/model3d" xmlns:o="urn:schemas-microsoft-com:office:office" xmlns:oel="http://schemas.microsoft.com/office/2019/extlst" xmlns:r="http://schemas.openxmlformats.org/officeDocument/2006/relationships" xmlns:m="http://schemas.openxmlformats.org/officeDocument/2006/math" xmlns:v="urn:schemas-microsoft-com:vml" xmlns:wp14="http://schemas.microsoft.com/office/word/2010/wordprocessingDrawing" xmlns:wp="http://schemas.openxmlformats.org/drawingml/2006/wordprocessingDrawing" xmlns:w10="urn:schemas-microsoft-com:office:word" xmlns:w="http://schemas.openxmlformats.org/wordprocessingml/2006/main" xmlns:w14="http://schemas.microsoft.com/office/word/2010/wordml" xmlns:w15="http://schemas.microsoft.com/office/word/2012/wordml" xmlns:w16cex="http://schemas.microsoft.com/office/word/2018/wordml/cex" xmlns:w16cid="http://schemas.microsoft.com/office/word/2016/wordml/cid" xmlns:w16="http://schemas.microsoft.com/office/word/2018/wordml" xmlns:w16du="http://schemas.microsoft.com/office/word/2023/wordml/word16du" xmlns:w16sdtdh="http://schemas.microsoft.com/office/word/2020/wordml/sdtdatahash" xmlns:w16sdtfl="http://schemas.microsoft.com/office/word/2024/wordml/sdtformatlock" xmlns:w16se="http://schemas.microsoft.com/office/word/2015/wordml/symex" xmlns:wpg="http://schemas.microsoft.com/office/word/2010/wordprocessingGroup" xmlns:wpi="http://schemas.microsoft.com/office/word/2010/wordprocessingInk" xmlns:wne="http://schemas.microsoft.com/office/word/2006/wordml" xmlns:wps="http://schemas.microsoft.com/office/word/2010/wordprocessingShape" mc:Ignorable="w14 w15 w16se w16cid w16 w16cex w16sdtdh w16sdtfl w16du wp14">
+  <w16cid:commentId w16cid:paraId="7AB035E5" w16cid:durableId="76570689"/>
+</w16cid:commentsIds>
 </file>
 
 <file path=word/endnotes.xml><?xml version="1.0" encoding="utf-8"?>
@@ -12402,6 +12471,14 @@
     <w:abstractNumId w:val="9"/>
   </w:num>
 </w:numbering>
+</file>
+
+<file path=word/people.xml><?xml version="1.0" encoding="utf-8"?>
+<w15:people xmlns:wpc="http://schemas.microsoft.com/office/word/2010/wordprocessingCanvas" xmlns:cx="http://schemas.microsoft.com/office/drawing/2014/chartex" xmlns:cx1="http://schemas.microsoft.com/office/drawing/2015/9/8/chartex" xmlns:cx2="http://schemas.microsoft.com/office/drawing/2015/10/21/chartex" xmlns:cx3="http://schemas.microsoft.com/office/drawing/2016/5/9/chartex" xmlns:cx4="http://schemas.microsoft.com/office/drawing/2016/5/10/chartex" xmlns:cx5="http://schemas.microsoft.com/office/drawing/2016/5/11/chartex" xmlns:cx6="http://schemas.microsoft.com/office/drawing/2016/5/12/chartex" xmlns:cx7="http://schemas.microsoft.com/office/drawing/2016/5/13/chartex" xmlns:cx8="http://schemas.microsoft.com/office/drawing/2016/5/14/chartex" xmlns:mc="http://schemas.openxmlformats.org/markup-compatibility/2006" xmlns:aink="http://schemas.microsoft.com/office/drawing/2016/ink" xmlns:am3d="http://schemas.microsoft.com/office/drawing/2017/model3d" xmlns:o="urn:schemas-microsoft-com:office:office" xmlns:oel="http://schemas.microsoft.com/office/2019/extlst" xmlns:r="http://schemas.openxmlformats.org/officeDocument/2006/relationships" xmlns:m="http://schemas.openxmlformats.org/officeDocument/2006/math" xmlns:v="urn:schemas-microsoft-com:vml" xmlns:wp14="http://schemas.microsoft.com/office/word/2010/wordprocessingDrawing" xmlns:wp="http://schemas.openxmlformats.org/drawingml/2006/wordprocessingDrawing" xmlns:w10="urn:schemas-microsoft-com:office:word" xmlns:w="http://schemas.openxmlformats.org/wordprocessingml/2006/main" xmlns:w14="http://schemas.microsoft.com/office/word/2010/wordml" xmlns:w15="http://schemas.microsoft.com/office/word/2012/wordml" xmlns:w16cex="http://schemas.microsoft.com/office/word/2018/wordml/cex" xmlns:w16cid="http://schemas.microsoft.com/office/word/2016/wordml/cid" xmlns:w16="http://schemas.microsoft.com/office/word/2018/wordml" xmlns:w16du="http://schemas.microsoft.com/office/word/2023/wordml/word16du" xmlns:w16sdtdh="http://schemas.microsoft.com/office/word/2020/wordml/sdtdatahash" xmlns:w16sdtfl="http://schemas.microsoft.com/office/word/2024/wordml/sdtformatlock" xmlns:w16se="http://schemas.microsoft.com/office/word/2015/wordml/symex" xmlns:wpg="http://schemas.microsoft.com/office/word/2010/wordprocessingGroup" xmlns:wpi="http://schemas.microsoft.com/office/word/2010/wordprocessingInk" xmlns:wne="http://schemas.microsoft.com/office/word/2006/wordml" xmlns:wps="http://schemas.microsoft.com/office/word/2010/wordprocessingShape" mc:Ignorable="w14 w15 w16se w16cid w16 w16cex w16sdtdh w16sdtfl w16du wp14">
+  <w15:person w15:author="Hai Nguyen">
+    <w15:presenceInfo w15:providerId="AD" w15:userId="S::hai.a.nguyen@avanade.com::cc3719a6-0c88-4679-90ec-1402ce163fcf"/>
+  </w15:person>
+</w15:people>
 </file>
 
 <file path=word/styles.xml><?xml version="1.0" encoding="utf-8"?>
@@ -23865,6 +23942,76 @@
       <w:u w:val="single"/>
     </w:rPr>
   </w:style>
+  <w:style w:type="character" w:styleId="CommentReference">
+    <w:name w:val="annotation reference"/>
+    <w:basedOn w:val="DefaultParagraphFont"/>
+    <w:uiPriority w:val="99"/>
+    <w:semiHidden/>
+    <w:unhideWhenUsed/>
+    <w:rsid w:val="00DB7C94"/>
+    <w:rPr>
+      <w:sz w:val="16"/>
+      <w:szCs w:val="16"/>
+    </w:rPr>
+  </w:style>
+  <w:style w:type="paragraph" w:styleId="CommentText">
+    <w:name w:val="annotation text"/>
+    <w:basedOn w:val="Normal"/>
+    <w:link w:val="CommentTextChar"/>
+    <w:uiPriority w:val="99"/>
+    <w:unhideWhenUsed/>
+    <w:rsid w:val="00DB7C94"/>
+    <w:pPr>
+      <w:spacing w:line="240" w:lineRule="auto"/>
+    </w:pPr>
+    <w:rPr>
+      <w:sz w:val="20"/>
+      <w:szCs w:val="20"/>
+    </w:rPr>
+  </w:style>
+  <w:style w:type="character" w:customStyle="1" w:styleId="CommentTextChar">
+    <w:name w:val="Comment Text Char"/>
+    <w:basedOn w:val="DefaultParagraphFont"/>
+    <w:link w:val="CommentText"/>
+    <w:uiPriority w:val="99"/>
+    <w:rsid w:val="00DB7C94"/>
+    <w:rPr>
+      <w:rFonts w:ascii="Segoe UI" w:hAnsi="Segoe UI" w:cs="Segoe UI"/>
+      <w:color w:val="333333"/>
+      <w:sz w:val="20"/>
+      <w:szCs w:val="20"/>
+    </w:rPr>
+  </w:style>
+  <w:style w:type="paragraph" w:styleId="CommentSubject">
+    <w:name w:val="annotation subject"/>
+    <w:basedOn w:val="CommentText"/>
+    <w:next w:val="CommentText"/>
+    <w:link w:val="CommentSubjectChar"/>
+    <w:uiPriority w:val="99"/>
+    <w:semiHidden/>
+    <w:unhideWhenUsed/>
+    <w:rsid w:val="00DB7C94"/>
+    <w:rPr>
+      <w:b/>
+      <w:bCs/>
+    </w:rPr>
+  </w:style>
+  <w:style w:type="character" w:customStyle="1" w:styleId="CommentSubjectChar">
+    <w:name w:val="Comment Subject Char"/>
+    <w:basedOn w:val="CommentTextChar"/>
+    <w:link w:val="CommentSubject"/>
+    <w:uiPriority w:val="99"/>
+    <w:semiHidden/>
+    <w:rsid w:val="00DB7C94"/>
+    <w:rPr>
+      <w:rFonts w:ascii="Segoe UI" w:hAnsi="Segoe UI" w:cs="Segoe UI"/>
+      <w:b/>
+      <w:bCs/>
+      <w:color w:val="333333"/>
+      <w:sz w:val="20"/>
+      <w:szCs w:val="20"/>
+    </w:rPr>
+  </w:style>
 </w:styles>
 </file>
 

</xml_diff>

<commit_message>
Add Technical Failure status and email-report mock; update FDD/requirements docs and Word deliverable
Co-authored-by: Copilot <223556219+Copilot@users.noreply.github.com>
</commit_message>
<xml_diff>
--- a/IPCorrespondence/Vertex IP FDD - Avanade Formatted.docx
+++ b/IPCorrespondence/Vertex IP FDD - Avanade Formatted.docx
@@ -2772,13 +2772,13 @@
           <w14:ligatures w14:val="standardContextual"/>
         </w:rPr>
       </w:pPr>
-      <w:hyperlink w:anchor="_Toc242351054" w:history="1">
+      <w:hyperlink w:anchor="_Toc242351055" w:history="1">
         <w:r>
           <w:rPr>
             <w:rStyle w:val="Hyperlink"/>
             <w:noProof/>
           </w:rPr>
-          <w:t>Supported Family References</w:t>
+          <w:t>Reference Search Order</w:t>
         </w:r>
         <w:r>
           <w:rPr>
@@ -2799,7 +2799,7 @@
             <w:noProof/>
             <w:webHidden/>
           </w:rPr>
-          <w:instrText xml:space="preserve"> PAGEREF _Toc242351054 \h </w:instrText>
+          <w:instrText xml:space="preserve"> PAGEREF _Toc242351055 \h </w:instrText>
         </w:r>
         <w:r>
           <w:rPr>
@@ -2819,7 +2819,303 @@
             <w:noProof/>
             <w:webHidden/>
           </w:rPr>
-          <w:t>10</w:t>
+          <w:t>11</w:t>
+        </w:r>
+        <w:r>
+          <w:rPr>
+            <w:noProof/>
+            <w:webHidden/>
+          </w:rPr>
+          <w:fldChar w:fldCharType="end"/>
+        </w:r>
+      </w:hyperlink>
+    </w:p>
+    <w:p>
+      <w:pPr>
+        <w:pStyle w:val="TOC3"/>
+        <w:tabs>
+          <w:tab w:val="right" w:leader="dot" w:pos="9736"/>
+        </w:tabs>
+        <w:rPr>
+          <w:rFonts w:asciiTheme="minorHAnsi" w:hAnsiTheme="minorHAnsi" w:cstheme="minorBidi"/>
+          <w:noProof/>
+          <w:color w:val="auto"/>
+          <w:kern w:val="2"/>
+          <w:sz w:val="24"/>
+          <w:szCs w:val="24"/>
+          <w14:ligatures w14:val="standardContextual"/>
+        </w:rPr>
+      </w:pPr>
+      <w:hyperlink w:anchor="_Toc242351056" w:history="1">
+        <w:r>
+          <w:rPr>
+            <w:rStyle w:val="Hyperlink"/>
+            <w:noProof/>
+          </w:rPr>
+          <w:t>Priority 1</w:t>
+        </w:r>
+        <w:r>
+          <w:rPr>
+            <w:noProof/>
+            <w:webHidden/>
+          </w:rPr>
+          <w:tab/>
+        </w:r>
+        <w:r>
+          <w:rPr>
+            <w:noProof/>
+            <w:webHidden/>
+          </w:rPr>
+          <w:fldChar w:fldCharType="begin"/>
+        </w:r>
+        <w:r>
+          <w:rPr>
+            <w:noProof/>
+            <w:webHidden/>
+          </w:rPr>
+          <w:instrText xml:space="preserve"> PAGEREF _Toc242351056 \h </w:instrText>
+        </w:r>
+        <w:r>
+          <w:rPr>
+            <w:noProof/>
+            <w:webHidden/>
+          </w:rPr>
+        </w:r>
+        <w:r>
+          <w:rPr>
+            <w:noProof/>
+            <w:webHidden/>
+          </w:rPr>
+          <w:fldChar w:fldCharType="separate"/>
+        </w:r>
+        <w:r>
+          <w:rPr>
+            <w:noProof/>
+            <w:webHidden/>
+          </w:rPr>
+          <w:t>11</w:t>
+        </w:r>
+        <w:r>
+          <w:rPr>
+            <w:noProof/>
+            <w:webHidden/>
+          </w:rPr>
+          <w:fldChar w:fldCharType="end"/>
+        </w:r>
+      </w:hyperlink>
+    </w:p>
+    <w:p>
+      <w:pPr>
+        <w:pStyle w:val="TOC3"/>
+        <w:tabs>
+          <w:tab w:val="right" w:leader="dot" w:pos="9736"/>
+        </w:tabs>
+        <w:rPr>
+          <w:rFonts w:asciiTheme="minorHAnsi" w:hAnsiTheme="minorHAnsi" w:cstheme="minorBidi"/>
+          <w:noProof/>
+          <w:color w:val="auto"/>
+          <w:kern w:val="2"/>
+          <w:sz w:val="24"/>
+          <w:szCs w:val="24"/>
+          <w14:ligatures w14:val="standardContextual"/>
+        </w:rPr>
+      </w:pPr>
+      <w:hyperlink w:anchor="_Toc242351057" w:history="1">
+        <w:r>
+          <w:rPr>
+            <w:rStyle w:val="Hyperlink"/>
+            <w:noProof/>
+          </w:rPr>
+          <w:t>Priority 2</w:t>
+        </w:r>
+        <w:r>
+          <w:rPr>
+            <w:noProof/>
+            <w:webHidden/>
+          </w:rPr>
+          <w:tab/>
+        </w:r>
+        <w:r>
+          <w:rPr>
+            <w:noProof/>
+            <w:webHidden/>
+          </w:rPr>
+          <w:fldChar w:fldCharType="begin"/>
+        </w:r>
+        <w:r>
+          <w:rPr>
+            <w:noProof/>
+            <w:webHidden/>
+          </w:rPr>
+          <w:instrText xml:space="preserve"> PAGEREF _Toc242351057 \h </w:instrText>
+        </w:r>
+        <w:r>
+          <w:rPr>
+            <w:noProof/>
+            <w:webHidden/>
+          </w:rPr>
+        </w:r>
+        <w:r>
+          <w:rPr>
+            <w:noProof/>
+            <w:webHidden/>
+          </w:rPr>
+          <w:fldChar w:fldCharType="separate"/>
+        </w:r>
+        <w:r>
+          <w:rPr>
+            <w:noProof/>
+            <w:webHidden/>
+          </w:rPr>
+          <w:t>11</w:t>
+        </w:r>
+        <w:r>
+          <w:rPr>
+            <w:noProof/>
+            <w:webHidden/>
+          </w:rPr>
+          <w:fldChar w:fldCharType="end"/>
+        </w:r>
+      </w:hyperlink>
+    </w:p>
+    <w:p>
+      <w:pPr>
+        <w:pStyle w:val="TOC3"/>
+        <w:tabs>
+          <w:tab w:val="right" w:leader="dot" w:pos="9736"/>
+        </w:tabs>
+        <w:rPr>
+          <w:rFonts w:asciiTheme="minorHAnsi" w:hAnsiTheme="minorHAnsi" w:cstheme="minorBidi"/>
+          <w:noProof/>
+          <w:color w:val="auto"/>
+          <w:kern w:val="2"/>
+          <w:sz w:val="24"/>
+          <w:szCs w:val="24"/>
+          <w14:ligatures w14:val="standardContextual"/>
+        </w:rPr>
+      </w:pPr>
+      <w:hyperlink w:anchor="_Toc242351058" w:history="1">
+        <w:r>
+          <w:rPr>
+            <w:rStyle w:val="Hyperlink"/>
+            <w:noProof/>
+          </w:rPr>
+          <w:t>Priority 3</w:t>
+        </w:r>
+        <w:r>
+          <w:rPr>
+            <w:noProof/>
+            <w:webHidden/>
+          </w:rPr>
+          <w:tab/>
+        </w:r>
+        <w:r>
+          <w:rPr>
+            <w:noProof/>
+            <w:webHidden/>
+          </w:rPr>
+          <w:fldChar w:fldCharType="begin"/>
+        </w:r>
+        <w:r>
+          <w:rPr>
+            <w:noProof/>
+            <w:webHidden/>
+          </w:rPr>
+          <w:instrText xml:space="preserve"> PAGEREF _Toc242351058 \h </w:instrText>
+        </w:r>
+        <w:r>
+          <w:rPr>
+            <w:noProof/>
+            <w:webHidden/>
+          </w:rPr>
+        </w:r>
+        <w:r>
+          <w:rPr>
+            <w:noProof/>
+            <w:webHidden/>
+          </w:rPr>
+          <w:fldChar w:fldCharType="separate"/>
+        </w:r>
+        <w:r>
+          <w:rPr>
+            <w:noProof/>
+            <w:webHidden/>
+          </w:rPr>
+          <w:t>11</w:t>
+        </w:r>
+        <w:r>
+          <w:rPr>
+            <w:noProof/>
+            <w:webHidden/>
+          </w:rPr>
+          <w:fldChar w:fldCharType="end"/>
+        </w:r>
+      </w:hyperlink>
+    </w:p>
+    <w:p>
+      <w:pPr>
+        <w:pStyle w:val="TOC1"/>
+        <w:tabs>
+          <w:tab w:val="right" w:leader="dot" w:pos="9736"/>
+        </w:tabs>
+        <w:rPr>
+          <w:rFonts w:asciiTheme="minorHAnsi" w:hAnsiTheme="minorHAnsi" w:cstheme="minorBidi"/>
+          <w:noProof/>
+          <w:color w:val="auto"/>
+          <w:kern w:val="2"/>
+          <w:sz w:val="24"/>
+          <w:szCs w:val="24"/>
+          <w14:ligatures w14:val="standardContextual"/>
+        </w:rPr>
+      </w:pPr>
+      <w:hyperlink w:anchor="_Toc242351059" w:history="1">
+        <w:r>
+          <w:rPr>
+            <w:rStyle w:val="Hyperlink"/>
+            <w:noProof/>
+          </w:rPr>
+          <w:t>7. Reference Normalization</w:t>
+        </w:r>
+        <w:r>
+          <w:rPr>
+            <w:noProof/>
+            <w:webHidden/>
+          </w:rPr>
+          <w:tab/>
+        </w:r>
+        <w:r>
+          <w:rPr>
+            <w:noProof/>
+            <w:webHidden/>
+          </w:rPr>
+          <w:fldChar w:fldCharType="begin"/>
+        </w:r>
+        <w:r>
+          <w:rPr>
+            <w:noProof/>
+            <w:webHidden/>
+          </w:rPr>
+          <w:instrText xml:space="preserve"> PAGEREF _Toc242351059 \h </w:instrText>
+        </w:r>
+        <w:r>
+          <w:rPr>
+            <w:noProof/>
+            <w:webHidden/>
+          </w:rPr>
+        </w:r>
+        <w:r>
+          <w:rPr>
+            <w:noProof/>
+            <w:webHidden/>
+          </w:rPr>
+          <w:fldChar w:fldCharType="separate"/>
+        </w:r>
+        <w:r>
+          <w:rPr>
+            <w:noProof/>
+            <w:webHidden/>
+          </w:rPr>
+          <w:t>12</w:t>
         </w:r>
         <w:r>
           <w:rPr>
@@ -2846,13 +3142,13 @@
           <w14:ligatures w14:val="standardContextual"/>
         </w:rPr>
       </w:pPr>
-      <w:hyperlink w:anchor="_Toc242351055" w:history="1">
+      <w:hyperlink w:anchor="_Toc242351060" w:history="1">
         <w:r>
           <w:rPr>
             <w:rStyle w:val="Hyperlink"/>
             <w:noProof/>
           </w:rPr>
-          <w:t>Reference Search Order</w:t>
+          <w:t>Examples</w:t>
         </w:r>
         <w:r>
           <w:rPr>
@@ -2873,7 +3169,7 @@
             <w:noProof/>
             <w:webHidden/>
           </w:rPr>
-          <w:instrText xml:space="preserve"> PAGEREF _Toc242351055 \h </w:instrText>
+          <w:instrText xml:space="preserve"> PAGEREF _Toc242351060 \h </w:instrText>
         </w:r>
         <w:r>
           <w:rPr>
@@ -2893,7 +3189,1137 @@
             <w:noProof/>
             <w:webHidden/>
           </w:rPr>
-          <w:t>11</w:t>
+          <w:t>12</w:t>
+        </w:r>
+        <w:r>
+          <w:rPr>
+            <w:noProof/>
+            <w:webHidden/>
+          </w:rPr>
+          <w:fldChar w:fldCharType="end"/>
+        </w:r>
+      </w:hyperlink>
+    </w:p>
+    <w:p>
+      <w:pPr>
+        <w:pStyle w:val="TOC2"/>
+        <w:tabs>
+          <w:tab w:val="right" w:leader="dot" w:pos="9736"/>
+        </w:tabs>
+        <w:rPr>
+          <w:rFonts w:asciiTheme="minorHAnsi" w:hAnsiTheme="minorHAnsi" w:cstheme="minorBidi"/>
+          <w:noProof/>
+          <w:color w:val="auto"/>
+          <w:kern w:val="2"/>
+          <w:sz w:val="24"/>
+          <w:szCs w:val="24"/>
+          <w14:ligatures w14:val="standardContextual"/>
+        </w:rPr>
+      </w:pPr>
+      <w:hyperlink w:anchor="_Toc242351061" w:history="1">
+        <w:r>
+          <w:rPr>
+            <w:rStyle w:val="Hyperlink"/>
+            <w:noProof/>
+          </w:rPr>
+          <w:t>Normalization Rules</w:t>
+        </w:r>
+        <w:r>
+          <w:rPr>
+            <w:noProof/>
+            <w:webHidden/>
+          </w:rPr>
+          <w:tab/>
+        </w:r>
+        <w:r>
+          <w:rPr>
+            <w:noProof/>
+            <w:webHidden/>
+          </w:rPr>
+          <w:fldChar w:fldCharType="begin"/>
+        </w:r>
+        <w:r>
+          <w:rPr>
+            <w:noProof/>
+            <w:webHidden/>
+          </w:rPr>
+          <w:instrText xml:space="preserve"> PAGEREF _Toc242351061 \h </w:instrText>
+        </w:r>
+        <w:r>
+          <w:rPr>
+            <w:noProof/>
+            <w:webHidden/>
+          </w:rPr>
+        </w:r>
+        <w:r>
+          <w:rPr>
+            <w:noProof/>
+            <w:webHidden/>
+          </w:rPr>
+          <w:fldChar w:fldCharType="separate"/>
+        </w:r>
+        <w:r>
+          <w:rPr>
+            <w:noProof/>
+            <w:webHidden/>
+          </w:rPr>
+          <w:t>12</w:t>
+        </w:r>
+        <w:r>
+          <w:rPr>
+            <w:noProof/>
+            <w:webHidden/>
+          </w:rPr>
+          <w:fldChar w:fldCharType="end"/>
+        </w:r>
+      </w:hyperlink>
+    </w:p>
+    <w:p>
+      <w:pPr>
+        <w:pStyle w:val="TOC1"/>
+        <w:tabs>
+          <w:tab w:val="right" w:leader="dot" w:pos="9736"/>
+        </w:tabs>
+        <w:rPr>
+          <w:rFonts w:asciiTheme="minorHAnsi" w:hAnsiTheme="minorHAnsi" w:cstheme="minorBidi"/>
+          <w:noProof/>
+          <w:color w:val="auto"/>
+          <w:kern w:val="2"/>
+          <w:sz w:val="24"/>
+          <w:szCs w:val="24"/>
+          <w14:ligatures w14:val="standardContextual"/>
+        </w:rPr>
+      </w:pPr>
+      <w:hyperlink w:anchor="_Toc242351062" w:history="1">
+        <w:r>
+          <w:rPr>
+            <w:rStyle w:val="Hyperlink"/>
+            <w:noProof/>
+          </w:rPr>
+          <w:t>8. Folder Structure</w:t>
+        </w:r>
+        <w:r>
+          <w:rPr>
+            <w:noProof/>
+            <w:webHidden/>
+          </w:rPr>
+          <w:tab/>
+        </w:r>
+        <w:r>
+          <w:rPr>
+            <w:noProof/>
+            <w:webHidden/>
+          </w:rPr>
+          <w:fldChar w:fldCharType="begin"/>
+        </w:r>
+        <w:r>
+          <w:rPr>
+            <w:noProof/>
+            <w:webHidden/>
+          </w:rPr>
+          <w:instrText xml:space="preserve"> PAGEREF _Toc242351062 \h </w:instrText>
+        </w:r>
+        <w:r>
+          <w:rPr>
+            <w:noProof/>
+            <w:webHidden/>
+          </w:rPr>
+        </w:r>
+        <w:r>
+          <w:rPr>
+            <w:noProof/>
+            <w:webHidden/>
+          </w:rPr>
+          <w:fldChar w:fldCharType="separate"/>
+        </w:r>
+        <w:r>
+          <w:rPr>
+            <w:noProof/>
+            <w:webHidden/>
+          </w:rPr>
+          <w:t>12</w:t>
+        </w:r>
+        <w:r>
+          <w:rPr>
+            <w:noProof/>
+            <w:webHidden/>
+          </w:rPr>
+          <w:fldChar w:fldCharType="end"/>
+        </w:r>
+      </w:hyperlink>
+    </w:p>
+    <w:p>
+      <w:pPr>
+        <w:pStyle w:val="TOC2"/>
+        <w:tabs>
+          <w:tab w:val="right" w:leader="dot" w:pos="9736"/>
+        </w:tabs>
+        <w:rPr>
+          <w:rFonts w:asciiTheme="minorHAnsi" w:hAnsiTheme="minorHAnsi" w:cstheme="minorBidi"/>
+          <w:noProof/>
+          <w:color w:val="auto"/>
+          <w:kern w:val="2"/>
+          <w:sz w:val="24"/>
+          <w:szCs w:val="24"/>
+          <w14:ligatures w14:val="standardContextual"/>
+        </w:rPr>
+      </w:pPr>
+      <w:hyperlink w:anchor="_Toc242351063" w:history="1">
+        <w:r>
+          <w:rPr>
+            <w:rStyle w:val="Hyperlink"/>
+            <w:noProof/>
+          </w:rPr>
+          <w:t>Expected Folder Architecture</w:t>
+        </w:r>
+        <w:r>
+          <w:rPr>
+            <w:noProof/>
+            <w:webHidden/>
+          </w:rPr>
+          <w:tab/>
+        </w:r>
+        <w:r>
+          <w:rPr>
+            <w:noProof/>
+            <w:webHidden/>
+          </w:rPr>
+          <w:fldChar w:fldCharType="begin"/>
+        </w:r>
+        <w:r>
+          <w:rPr>
+            <w:noProof/>
+            <w:webHidden/>
+          </w:rPr>
+          <w:instrText xml:space="preserve"> PAGEREF _Toc242351063 \h </w:instrText>
+        </w:r>
+        <w:r>
+          <w:rPr>
+            <w:noProof/>
+            <w:webHidden/>
+          </w:rPr>
+        </w:r>
+        <w:r>
+          <w:rPr>
+            <w:noProof/>
+            <w:webHidden/>
+          </w:rPr>
+          <w:fldChar w:fldCharType="separate"/>
+        </w:r>
+        <w:r>
+          <w:rPr>
+            <w:noProof/>
+            <w:webHidden/>
+          </w:rPr>
+          <w:t>12</w:t>
+        </w:r>
+        <w:r>
+          <w:rPr>
+            <w:noProof/>
+            <w:webHidden/>
+          </w:rPr>
+          <w:fldChar w:fldCharType="end"/>
+        </w:r>
+      </w:hyperlink>
+    </w:p>
+    <w:p>
+      <w:pPr>
+        <w:pStyle w:val="TOC3"/>
+      </w:pPr>
+      <w:r>
+        <w:t>One-Time Folder Migration</w:t>
+        <w:tab/>
+        <w:t>12</w:t>
+      </w:r>
+    </w:p>
+    <w:p>
+      <w:pPr>
+        <w:pStyle w:val="TOC1"/>
+        <w:tabs>
+          <w:tab w:val="right" w:leader="dot" w:pos="9736"/>
+        </w:tabs>
+        <w:rPr>
+          <w:rFonts w:asciiTheme="minorHAnsi" w:hAnsiTheme="minorHAnsi" w:cstheme="minorBidi"/>
+          <w:noProof/>
+          <w:color w:val="auto"/>
+          <w:kern w:val="2"/>
+          <w:sz w:val="24"/>
+          <w:szCs w:val="24"/>
+          <w14:ligatures w14:val="standardContextual"/>
+        </w:rPr>
+      </w:pPr>
+      <w:hyperlink w:anchor="_Toc242351064" w:history="1">
+        <w:r>
+          <w:rPr>
+            <w:rStyle w:val="Hyperlink"/>
+            <w:noProof/>
+          </w:rPr>
+          <w:t>9. Automated Filing Rules</w:t>
+        </w:r>
+        <w:r>
+          <w:rPr>
+            <w:noProof/>
+            <w:webHidden/>
+          </w:rPr>
+          <w:tab/>
+        </w:r>
+        <w:r>
+          <w:rPr>
+            <w:noProof/>
+            <w:webHidden/>
+          </w:rPr>
+          <w:fldChar w:fldCharType="begin"/>
+        </w:r>
+        <w:r>
+          <w:rPr>
+            <w:noProof/>
+            <w:webHidden/>
+          </w:rPr>
+          <w:instrText xml:space="preserve"> PAGEREF _Toc242351064 \h </w:instrText>
+        </w:r>
+        <w:r>
+          <w:rPr>
+            <w:noProof/>
+            <w:webHidden/>
+          </w:rPr>
+        </w:r>
+        <w:r>
+          <w:rPr>
+            <w:noProof/>
+            <w:webHidden/>
+          </w:rPr>
+          <w:fldChar w:fldCharType="separate"/>
+        </w:r>
+        <w:r>
+          <w:rPr>
+            <w:noProof/>
+            <w:webHidden/>
+          </w:rPr>
+          <w:t>13</w:t>
+        </w:r>
+        <w:r>
+          <w:rPr>
+            <w:noProof/>
+            <w:webHidden/>
+          </w:rPr>
+          <w:fldChar w:fldCharType="end"/>
+        </w:r>
+      </w:hyperlink>
+    </w:p>
+    <w:p>
+      <w:pPr>
+        <w:pStyle w:val="TOC2"/>
+        <w:tabs>
+          <w:tab w:val="right" w:leader="dot" w:pos="9736"/>
+        </w:tabs>
+        <w:rPr>
+          <w:rFonts w:asciiTheme="minorHAnsi" w:hAnsiTheme="minorHAnsi" w:cstheme="minorBidi"/>
+          <w:noProof/>
+          <w:color w:val="auto"/>
+          <w:kern w:val="2"/>
+          <w:sz w:val="24"/>
+          <w:szCs w:val="24"/>
+          <w14:ligatures w14:val="standardContextual"/>
+        </w:rPr>
+      </w:pPr>
+      <w:hyperlink w:anchor="_Toc242351065" w:history="1">
+        <w:r>
+          <w:rPr>
+            <w:rStyle w:val="Hyperlink"/>
+            <w:noProof/>
+          </w:rPr>
+          <w:t>Rule 1 – Single Valid Family</w:t>
+        </w:r>
+        <w:r>
+          <w:rPr>
+            <w:noProof/>
+            <w:webHidden/>
+          </w:rPr>
+          <w:tab/>
+        </w:r>
+        <w:r>
+          <w:rPr>
+            <w:noProof/>
+            <w:webHidden/>
+          </w:rPr>
+          <w:fldChar w:fldCharType="begin"/>
+        </w:r>
+        <w:r>
+          <w:rPr>
+            <w:noProof/>
+            <w:webHidden/>
+          </w:rPr>
+          <w:instrText xml:space="preserve"> PAGEREF _Toc242351065 \h </w:instrText>
+        </w:r>
+        <w:r>
+          <w:rPr>
+            <w:noProof/>
+            <w:webHidden/>
+          </w:rPr>
+        </w:r>
+        <w:r>
+          <w:rPr>
+            <w:noProof/>
+            <w:webHidden/>
+          </w:rPr>
+          <w:fldChar w:fldCharType="separate"/>
+        </w:r>
+        <w:r>
+          <w:rPr>
+            <w:noProof/>
+            <w:webHidden/>
+          </w:rPr>
+          <w:t>13</w:t>
+        </w:r>
+        <w:r>
+          <w:rPr>
+            <w:noProof/>
+            <w:webHidden/>
+          </w:rPr>
+          <w:fldChar w:fldCharType="end"/>
+        </w:r>
+      </w:hyperlink>
+    </w:p>
+    <w:p>
+      <w:pPr>
+        <w:pStyle w:val="TOC2"/>
+        <w:tabs>
+          <w:tab w:val="right" w:leader="dot" w:pos="9736"/>
+        </w:tabs>
+        <w:rPr>
+          <w:rFonts w:asciiTheme="minorHAnsi" w:hAnsiTheme="minorHAnsi" w:cstheme="minorBidi"/>
+          <w:noProof/>
+          <w:color w:val="auto"/>
+          <w:kern w:val="2"/>
+          <w:sz w:val="24"/>
+          <w:szCs w:val="24"/>
+          <w14:ligatures w14:val="standardContextual"/>
+        </w:rPr>
+      </w:pPr>
+      <w:hyperlink w:anchor="_Toc242351066" w:history="1">
+        <w:r>
+          <w:rPr>
+            <w:rStyle w:val="Hyperlink"/>
+            <w:noProof/>
+          </w:rPr>
+          <w:t>Rule 2 – Folder Exists</w:t>
+        </w:r>
+        <w:r>
+          <w:rPr>
+            <w:noProof/>
+            <w:webHidden/>
+          </w:rPr>
+          <w:tab/>
+        </w:r>
+        <w:r>
+          <w:rPr>
+            <w:noProof/>
+            <w:webHidden/>
+          </w:rPr>
+          <w:fldChar w:fldCharType="begin"/>
+        </w:r>
+        <w:r>
+          <w:rPr>
+            <w:noProof/>
+            <w:webHidden/>
+          </w:rPr>
+          <w:instrText xml:space="preserve"> PAGEREF _Toc242351066 \h </w:instrText>
+        </w:r>
+        <w:r>
+          <w:rPr>
+            <w:noProof/>
+            <w:webHidden/>
+          </w:rPr>
+        </w:r>
+        <w:r>
+          <w:rPr>
+            <w:noProof/>
+            <w:webHidden/>
+          </w:rPr>
+          <w:fldChar w:fldCharType="separate"/>
+        </w:r>
+        <w:r>
+          <w:rPr>
+            <w:noProof/>
+            <w:webHidden/>
+          </w:rPr>
+          <w:t>13</w:t>
+        </w:r>
+        <w:r>
+          <w:rPr>
+            <w:noProof/>
+            <w:webHidden/>
+          </w:rPr>
+          <w:fldChar w:fldCharType="end"/>
+        </w:r>
+      </w:hyperlink>
+    </w:p>
+    <w:p>
+      <w:pPr>
+        <w:pStyle w:val="TOC2"/>
+        <w:tabs>
+          <w:tab w:val="right" w:leader="dot" w:pos="9736"/>
+        </w:tabs>
+        <w:rPr>
+          <w:rFonts w:asciiTheme="minorHAnsi" w:hAnsiTheme="minorHAnsi" w:cstheme="minorBidi"/>
+          <w:noProof/>
+          <w:color w:val="auto"/>
+          <w:kern w:val="2"/>
+          <w:sz w:val="24"/>
+          <w:szCs w:val="24"/>
+          <w14:ligatures w14:val="standardContextual"/>
+        </w:rPr>
+      </w:pPr>
+      <w:hyperlink w:anchor="_Toc242351067" w:history="1">
+        <w:r>
+          <w:rPr>
+            <w:rStyle w:val="Hyperlink"/>
+            <w:noProof/>
+          </w:rPr>
+          <w:t>Rule 3 – Folder Missing</w:t>
+        </w:r>
+        <w:r>
+          <w:rPr>
+            <w:noProof/>
+            <w:webHidden/>
+          </w:rPr>
+          <w:tab/>
+        </w:r>
+        <w:r>
+          <w:rPr>
+            <w:noProof/>
+            <w:webHidden/>
+          </w:rPr>
+          <w:fldChar w:fldCharType="begin"/>
+        </w:r>
+        <w:r>
+          <w:rPr>
+            <w:noProof/>
+            <w:webHidden/>
+          </w:rPr>
+          <w:instrText xml:space="preserve"> PAGEREF _Toc242351067 \h </w:instrText>
+        </w:r>
+        <w:r>
+          <w:rPr>
+            <w:noProof/>
+            <w:webHidden/>
+          </w:rPr>
+        </w:r>
+        <w:r>
+          <w:rPr>
+            <w:noProof/>
+            <w:webHidden/>
+          </w:rPr>
+          <w:fldChar w:fldCharType="separate"/>
+        </w:r>
+        <w:r>
+          <w:rPr>
+            <w:noProof/>
+            <w:webHidden/>
+          </w:rPr>
+          <w:t>13</w:t>
+        </w:r>
+        <w:r>
+          <w:rPr>
+            <w:noProof/>
+            <w:webHidden/>
+          </w:rPr>
+          <w:fldChar w:fldCharType="end"/>
+        </w:r>
+      </w:hyperlink>
+    </w:p>
+    <w:p>
+      <w:pPr>
+        <w:pStyle w:val="TOC1"/>
+        <w:tabs>
+          <w:tab w:val="right" w:leader="dot" w:pos="9736"/>
+        </w:tabs>
+        <w:rPr>
+          <w:rFonts w:asciiTheme="minorHAnsi" w:hAnsiTheme="minorHAnsi" w:cstheme="minorBidi"/>
+          <w:noProof/>
+          <w:color w:val="auto"/>
+          <w:kern w:val="2"/>
+          <w:sz w:val="24"/>
+          <w:szCs w:val="24"/>
+          <w14:ligatures w14:val="standardContextual"/>
+        </w:rPr>
+      </w:pPr>
+      <w:hyperlink w:anchor="_Toc242351068" w:history="1">
+        <w:r>
+          <w:rPr>
+            <w:rStyle w:val="Hyperlink"/>
+            <w:noProof/>
+          </w:rPr>
+          <w:t>10. Exception Rules</w:t>
+        </w:r>
+        <w:r>
+          <w:rPr>
+            <w:noProof/>
+            <w:webHidden/>
+          </w:rPr>
+          <w:tab/>
+        </w:r>
+        <w:r>
+          <w:rPr>
+            <w:noProof/>
+            <w:webHidden/>
+          </w:rPr>
+          <w:fldChar w:fldCharType="begin"/>
+        </w:r>
+        <w:r>
+          <w:rPr>
+            <w:noProof/>
+            <w:webHidden/>
+          </w:rPr>
+          <w:instrText xml:space="preserve"> PAGEREF _Toc242351068 \h </w:instrText>
+        </w:r>
+        <w:r>
+          <w:rPr>
+            <w:noProof/>
+            <w:webHidden/>
+          </w:rPr>
+        </w:r>
+        <w:r>
+          <w:rPr>
+            <w:noProof/>
+            <w:webHidden/>
+          </w:rPr>
+          <w:fldChar w:fldCharType="separate"/>
+        </w:r>
+        <w:r>
+          <w:rPr>
+            <w:noProof/>
+            <w:webHidden/>
+          </w:rPr>
+          <w:t>13</w:t>
+        </w:r>
+        <w:r>
+          <w:rPr>
+            <w:noProof/>
+            <w:webHidden/>
+          </w:rPr>
+          <w:fldChar w:fldCharType="end"/>
+        </w:r>
+      </w:hyperlink>
+    </w:p>
+    <w:p>
+      <w:pPr>
+        <w:pStyle w:val="TOC2"/>
+        <w:tabs>
+          <w:tab w:val="right" w:leader="dot" w:pos="9736"/>
+        </w:tabs>
+        <w:rPr>
+          <w:rFonts w:asciiTheme="minorHAnsi" w:hAnsiTheme="minorHAnsi" w:cstheme="minorBidi"/>
+          <w:noProof/>
+          <w:color w:val="auto"/>
+          <w:kern w:val="2"/>
+          <w:sz w:val="24"/>
+          <w:szCs w:val="24"/>
+          <w14:ligatures w14:val="standardContextual"/>
+        </w:rPr>
+      </w:pPr>
+      <w:hyperlink w:anchor="_Toc242351069" w:history="1">
+        <w:r>
+          <w:rPr>
+            <w:rStyle w:val="Hyperlink"/>
+            <w:noProof/>
+          </w:rPr>
+          <w:t>Exception 1 – No Reference Found</w:t>
+        </w:r>
+        <w:r>
+          <w:rPr>
+            <w:noProof/>
+            <w:webHidden/>
+          </w:rPr>
+          <w:tab/>
+        </w:r>
+        <w:r>
+          <w:rPr>
+            <w:noProof/>
+            <w:webHidden/>
+          </w:rPr>
+          <w:fldChar w:fldCharType="begin"/>
+        </w:r>
+        <w:r>
+          <w:rPr>
+            <w:noProof/>
+            <w:webHidden/>
+          </w:rPr>
+          <w:instrText xml:space="preserve"> PAGEREF _Toc242351069 \h </w:instrText>
+        </w:r>
+        <w:r>
+          <w:rPr>
+            <w:noProof/>
+            <w:webHidden/>
+          </w:rPr>
+        </w:r>
+        <w:r>
+          <w:rPr>
+            <w:noProof/>
+            <w:webHidden/>
+          </w:rPr>
+          <w:fldChar w:fldCharType="separate"/>
+        </w:r>
+        <w:r>
+          <w:rPr>
+            <w:noProof/>
+            <w:webHidden/>
+          </w:rPr>
+          <w:t>13</w:t>
+        </w:r>
+        <w:r>
+          <w:rPr>
+            <w:noProof/>
+            <w:webHidden/>
+          </w:rPr>
+          <w:fldChar w:fldCharType="end"/>
+        </w:r>
+      </w:hyperlink>
+    </w:p>
+    <w:p>
+      <w:pPr>
+        <w:pStyle w:val="TOC2"/>
+        <w:tabs>
+          <w:tab w:val="right" w:leader="dot" w:pos="9736"/>
+        </w:tabs>
+        <w:rPr>
+          <w:rFonts w:asciiTheme="minorHAnsi" w:hAnsiTheme="minorHAnsi" w:cstheme="minorBidi"/>
+          <w:noProof/>
+          <w:color w:val="auto"/>
+          <w:kern w:val="2"/>
+          <w:sz w:val="24"/>
+          <w:szCs w:val="24"/>
+          <w14:ligatures w14:val="standardContextual"/>
+        </w:rPr>
+      </w:pPr>
+      <w:hyperlink w:anchor="_Toc242351070" w:history="1">
+        <w:r>
+          <w:rPr>
+            <w:rStyle w:val="Hyperlink"/>
+            <w:noProof/>
+          </w:rPr>
+          <w:t>Exception 2 – Multiple Family References</w:t>
+        </w:r>
+        <w:r>
+          <w:rPr>
+            <w:noProof/>
+            <w:webHidden/>
+          </w:rPr>
+          <w:tab/>
+        </w:r>
+        <w:r>
+          <w:rPr>
+            <w:noProof/>
+            <w:webHidden/>
+          </w:rPr>
+          <w:fldChar w:fldCharType="begin"/>
+        </w:r>
+        <w:r>
+          <w:rPr>
+            <w:noProof/>
+            <w:webHidden/>
+          </w:rPr>
+          <w:instrText xml:space="preserve"> PAGEREF _Toc242351070 \h </w:instrText>
+        </w:r>
+        <w:r>
+          <w:rPr>
+            <w:noProof/>
+            <w:webHidden/>
+          </w:rPr>
+        </w:r>
+        <w:r>
+          <w:rPr>
+            <w:noProof/>
+            <w:webHidden/>
+          </w:rPr>
+          <w:fldChar w:fldCharType="separate"/>
+        </w:r>
+        <w:r>
+          <w:rPr>
+            <w:noProof/>
+            <w:webHidden/>
+          </w:rPr>
+          <w:t>14</w:t>
+        </w:r>
+        <w:r>
+          <w:rPr>
+            <w:noProof/>
+            <w:webHidden/>
+          </w:rPr>
+          <w:fldChar w:fldCharType="end"/>
+        </w:r>
+      </w:hyperlink>
+    </w:p>
+    <w:p>
+      <w:pPr>
+        <w:pStyle w:val="TOC2"/>
+        <w:tabs>
+          <w:tab w:val="right" w:leader="dot" w:pos="9736"/>
+        </w:tabs>
+        <w:rPr>
+          <w:rFonts w:asciiTheme="minorHAnsi" w:hAnsiTheme="minorHAnsi" w:cstheme="minorBidi"/>
+          <w:noProof/>
+          <w:color w:val="auto"/>
+          <w:kern w:val="2"/>
+          <w:sz w:val="24"/>
+          <w:szCs w:val="24"/>
+          <w14:ligatures w14:val="standardContextual"/>
+        </w:rPr>
+      </w:pPr>
+      <w:hyperlink w:anchor="_Toc242351071" w:history="1">
+        <w:r>
+          <w:rPr>
+            <w:rStyle w:val="Hyperlink"/>
+            <w:noProof/>
+          </w:rPr>
+          <w:t>Exception 3 – Subject/Body Conflict</w:t>
+        </w:r>
+        <w:r>
+          <w:rPr>
+            <w:noProof/>
+            <w:webHidden/>
+          </w:rPr>
+          <w:tab/>
+        </w:r>
+        <w:r>
+          <w:rPr>
+            <w:noProof/>
+            <w:webHidden/>
+          </w:rPr>
+          <w:fldChar w:fldCharType="begin"/>
+        </w:r>
+        <w:r>
+          <w:rPr>
+            <w:noProof/>
+            <w:webHidden/>
+          </w:rPr>
+          <w:instrText xml:space="preserve"> PAGEREF _Toc242351071 \h </w:instrText>
+        </w:r>
+        <w:r>
+          <w:rPr>
+            <w:noProof/>
+            <w:webHidden/>
+          </w:rPr>
+        </w:r>
+        <w:r>
+          <w:rPr>
+            <w:noProof/>
+            <w:webHidden/>
+          </w:rPr>
+          <w:fldChar w:fldCharType="separate"/>
+        </w:r>
+        <w:r>
+          <w:rPr>
+            <w:noProof/>
+            <w:webHidden/>
+          </w:rPr>
+          <w:t>14</w:t>
+        </w:r>
+        <w:r>
+          <w:rPr>
+            <w:noProof/>
+            <w:webHidden/>
+          </w:rPr>
+          <w:fldChar w:fldCharType="end"/>
+        </w:r>
+      </w:hyperlink>
+    </w:p>
+    <w:p>
+      <w:pPr>
+        <w:pStyle w:val="TOC2"/>
+        <w:tabs>
+          <w:tab w:val="right" w:leader="dot" w:pos="9736"/>
+        </w:tabs>
+        <w:rPr>
+          <w:rFonts w:asciiTheme="minorHAnsi" w:hAnsiTheme="minorHAnsi" w:cstheme="minorBidi"/>
+          <w:noProof/>
+          <w:color w:val="auto"/>
+          <w:kern w:val="2"/>
+          <w:sz w:val="24"/>
+          <w:szCs w:val="24"/>
+          <w14:ligatures w14:val="standardContextual"/>
+        </w:rPr>
+      </w:pPr>
+      <w:hyperlink w:anchor="_Toc242351072" w:history="1">
+        <w:r>
+          <w:rPr>
+            <w:rStyle w:val="Hyperlink"/>
+            <w:noProof/>
+          </w:rPr>
+          <w:t>Exception 4 – Conflicting References in Quoted History</w:t>
+        </w:r>
+        <w:r>
+          <w:rPr>
+            <w:noProof/>
+            <w:webHidden/>
+          </w:rPr>
+          <w:tab/>
+        </w:r>
+        <w:r>
+          <w:rPr>
+            <w:noProof/>
+            <w:webHidden/>
+          </w:rPr>
+          <w:fldChar w:fldCharType="begin"/>
+        </w:r>
+        <w:r>
+          <w:rPr>
+            <w:noProof/>
+            <w:webHidden/>
+          </w:rPr>
+          <w:instrText xml:space="preserve"> PAGEREF _Toc242351072 \h </w:instrText>
+        </w:r>
+        <w:r>
+          <w:rPr>
+            <w:noProof/>
+            <w:webHidden/>
+          </w:rPr>
+        </w:r>
+        <w:r>
+          <w:rPr>
+            <w:noProof/>
+            <w:webHidden/>
+          </w:rPr>
+          <w:fldChar w:fldCharType="separate"/>
+        </w:r>
+        <w:r>
+          <w:rPr>
+            <w:noProof/>
+            <w:webHidden/>
+          </w:rPr>
+          <w:t>14</w:t>
+        </w:r>
+        <w:r>
+          <w:rPr>
+            <w:noProof/>
+            <w:webHidden/>
+          </w:rPr>
+          <w:fldChar w:fldCharType="end"/>
+        </w:r>
+      </w:hyperlink>
+    </w:p>
+    <w:p>
+      <w:pPr>
+        <w:pStyle w:val="TOC2"/>
+        <w:tabs>
+          <w:tab w:val="right" w:leader="dot" w:pos="9736"/>
+        </w:tabs>
+        <w:rPr>
+          <w:rFonts w:asciiTheme="minorHAnsi" w:hAnsiTheme="minorHAnsi" w:cstheme="minorBidi"/>
+          <w:noProof/>
+          <w:color w:val="auto"/>
+          <w:kern w:val="2"/>
+          <w:sz w:val="24"/>
+          <w:szCs w:val="24"/>
+          <w14:ligatures w14:val="standardContextual"/>
+        </w:rPr>
+      </w:pPr>
+      <w:hyperlink w:anchor="_Toc242351073" w:history="1">
+        <w:r>
+          <w:rPr>
+            <w:rStyle w:val="Hyperlink"/>
+            <w:noProof/>
+          </w:rPr>
+          <w:t>Exception 5 – Folder Rule Validation Failure (Invalid Format)</w:t>
+        </w:r>
+        <w:r>
+          <w:rPr>
+            <w:noProof/>
+            <w:webHidden/>
+          </w:rPr>
+          <w:tab/>
+        </w:r>
+        <w:r>
+          <w:rPr>
+            <w:noProof/>
+            <w:webHidden/>
+          </w:rPr>
+          <w:fldChar w:fldCharType="begin"/>
+        </w:r>
+        <w:r>
+          <w:rPr>
+            <w:noProof/>
+            <w:webHidden/>
+          </w:rPr>
+          <w:instrText xml:space="preserve"> PAGEREF _Toc242351073 \h </w:instrText>
+        </w:r>
+        <w:r>
+          <w:rPr>
+            <w:noProof/>
+            <w:webHidden/>
+          </w:rPr>
+        </w:r>
+        <w:r>
+          <w:rPr>
+            <w:noProof/>
+            <w:webHidden/>
+          </w:rPr>
+          <w:fldChar w:fldCharType="separate"/>
+        </w:r>
+        <w:r>
+          <w:rPr>
+            <w:noProof/>
+            <w:webHidden/>
+          </w:rPr>
+          <w:t>14</w:t>
+        </w:r>
+        <w:r>
+          <w:rPr>
+            <w:noProof/>
+            <w:webHidden/>
+          </w:rPr>
+          <w:fldChar w:fldCharType="end"/>
+        </w:r>
+      </w:hyperlink>
+    </w:p>
+    <w:p>
+      <w:pPr>
+        <w:pStyle w:val="TOC2"/>
+        <w:tabs>
+          <w:tab w:val="right" w:leader="dot" w:pos="9736"/>
+        </w:tabs>
+        <w:rPr>
+          <w:rFonts w:asciiTheme="minorHAnsi" w:hAnsiTheme="minorHAnsi" w:cstheme="minorBidi"/>
+          <w:noProof/>
+          <w:color w:val="auto"/>
+          <w:kern w:val="2"/>
+          <w:sz w:val="24"/>
+          <w:szCs w:val="24"/>
+          <w14:ligatures w14:val="standardContextual"/>
+        </w:rPr>
+      </w:pPr>
+      <w:hyperlink w:anchor="_Toc242351074" w:history="1">
+        <w:r>
+          <w:rPr>
+            <w:rStyle w:val="Hyperlink"/>
+            <w:noProof/>
+          </w:rPr>
+          <w:t>Exception 6 – Attachment Only</w:t>
+        </w:r>
+        <w:r>
+          <w:rPr>
+            <w:noProof/>
+            <w:webHidden/>
+          </w:rPr>
+          <w:tab/>
+        </w:r>
+        <w:r>
+          <w:rPr>
+            <w:noProof/>
+            <w:webHidden/>
+          </w:rPr>
+          <w:fldChar w:fldCharType="begin"/>
+        </w:r>
+        <w:r>
+          <w:rPr>
+            <w:noProof/>
+            <w:webHidden/>
+          </w:rPr>
+          <w:instrText xml:space="preserve"> PAGEREF _Toc242351074 \h </w:instrText>
+        </w:r>
+        <w:r>
+          <w:rPr>
+            <w:noProof/>
+            <w:webHidden/>
+          </w:rPr>
+        </w:r>
+        <w:r>
+          <w:rPr>
+            <w:noProof/>
+            <w:webHidden/>
+          </w:rPr>
+          <w:fldChar w:fldCharType="separate"/>
+        </w:r>
+        <w:r>
+          <w:rPr>
+            <w:noProof/>
+            <w:webHidden/>
+          </w:rPr>
+          <w:t>15</w:t>
+        </w:r>
+        <w:r>
+          <w:rPr>
+            <w:noProof/>
+            <w:webHidden/>
+          </w:rPr>
+          <w:fldChar w:fldCharType="end"/>
+        </w:r>
+      </w:hyperlink>
+    </w:p>
+    <w:p>
+      <w:pPr>
+        <w:pStyle w:val="TOC2"/>
+      </w:pPr>
+      <w:r>
+        <w:t>Exception 7 – Technical Failure</w:t>
+        <w:tab/>
+        <w:t>15</w:t>
+      </w:r>
+    </w:p>
+    <w:p>
+      <w:pPr>
+        <w:pStyle w:val="TOC1"/>
+        <w:tabs>
+          <w:tab w:val="right" w:leader="dot" w:pos="9736"/>
+        </w:tabs>
+        <w:rPr>
+          <w:rFonts w:asciiTheme="minorHAnsi" w:hAnsiTheme="minorHAnsi" w:cstheme="minorBidi"/>
+          <w:noProof/>
+          <w:color w:val="auto"/>
+          <w:kern w:val="2"/>
+          <w:sz w:val="24"/>
+          <w:szCs w:val="24"/>
+          <w14:ligatures w14:val="standardContextual"/>
+        </w:rPr>
+      </w:pPr>
+      <w:hyperlink w:anchor="_Toc242351075" w:history="1">
+        <w:r>
+          <w:rPr>
+            <w:rStyle w:val="Hyperlink"/>
+            <w:noProof/>
+          </w:rPr>
+          <w:t>11. Folder Creation Process</w:t>
+        </w:r>
+        <w:r>
+          <w:rPr>
+            <w:noProof/>
+            <w:webHidden/>
+          </w:rPr>
+          <w:tab/>
+        </w:r>
+        <w:r>
+          <w:rPr>
+            <w:noProof/>
+            <w:webHidden/>
+          </w:rPr>
+          <w:fldChar w:fldCharType="begin"/>
+        </w:r>
+        <w:r>
+          <w:rPr>
+            <w:noProof/>
+            <w:webHidden/>
+          </w:rPr>
+          <w:instrText xml:space="preserve"> PAGEREF _Toc242351075 \h </w:instrText>
+        </w:r>
+        <w:r>
+          <w:rPr>
+            <w:noProof/>
+            <w:webHidden/>
+          </w:rPr>
+        </w:r>
+        <w:r>
+          <w:rPr>
+            <w:noProof/>
+            <w:webHidden/>
+          </w:rPr>
+          <w:fldChar w:fldCharType="separate"/>
+        </w:r>
+        <w:r>
+          <w:rPr>
+            <w:noProof/>
+            <w:webHidden/>
+          </w:rPr>
+          <w:t>15</w:t>
         </w:r>
         <w:r>
           <w:rPr>
@@ -2920,13 +4346,13 @@
           <w14:ligatures w14:val="standardContextual"/>
         </w:rPr>
       </w:pPr>
-      <w:hyperlink w:anchor="_Toc242351056" w:history="1">
+      <w:hyperlink w:anchor="_Toc242351076" w:history="1">
         <w:r>
           <w:rPr>
             <w:rStyle w:val="Hyperlink"/>
             <w:noProof/>
           </w:rPr>
-          <w:t>Priority 1</w:t>
+          <w:t>Step 1</w:t>
         </w:r>
         <w:r>
           <w:rPr>
@@ -2947,7 +4373,7 @@
             <w:noProof/>
             <w:webHidden/>
           </w:rPr>
-          <w:instrText xml:space="preserve"> PAGEREF _Toc242351056 \h </w:instrText>
+          <w:instrText xml:space="preserve"> PAGEREF _Toc242351076 \h </w:instrText>
         </w:r>
         <w:r>
           <w:rPr>
@@ -2967,7 +4393,7 @@
             <w:noProof/>
             <w:webHidden/>
           </w:rPr>
-          <w:t>11</w:t>
+          <w:t>15</w:t>
         </w:r>
         <w:r>
           <w:rPr>
@@ -2994,13 +4420,13 @@
           <w14:ligatures w14:val="standardContextual"/>
         </w:rPr>
       </w:pPr>
-      <w:hyperlink w:anchor="_Toc242351057" w:history="1">
+      <w:hyperlink w:anchor="_Toc242351077" w:history="1">
         <w:r>
           <w:rPr>
             <w:rStyle w:val="Hyperlink"/>
             <w:noProof/>
           </w:rPr>
-          <w:t>Priority 2</w:t>
+          <w:t>Step 2</w:t>
         </w:r>
         <w:r>
           <w:rPr>
@@ -3021,7 +4447,7 @@
             <w:noProof/>
             <w:webHidden/>
           </w:rPr>
-          <w:instrText xml:space="preserve"> PAGEREF _Toc242351057 \h </w:instrText>
+          <w:instrText xml:space="preserve"> PAGEREF _Toc242351077 \h </w:instrText>
         </w:r>
         <w:r>
           <w:rPr>
@@ -3041,7 +4467,7 @@
             <w:noProof/>
             <w:webHidden/>
           </w:rPr>
-          <w:t>11</w:t>
+          <w:t>15</w:t>
         </w:r>
         <w:r>
           <w:rPr>
@@ -3068,13 +4494,13 @@
           <w14:ligatures w14:val="standardContextual"/>
         </w:rPr>
       </w:pPr>
-      <w:hyperlink w:anchor="_Toc242351058" w:history="1">
+      <w:hyperlink w:anchor="_Toc242351078" w:history="1">
         <w:r>
           <w:rPr>
             <w:rStyle w:val="Hyperlink"/>
             <w:noProof/>
           </w:rPr>
-          <w:t>Priority 3</w:t>
+          <w:t>Step 3</w:t>
         </w:r>
         <w:r>
           <w:rPr>
@@ -3095,7 +4521,7 @@
             <w:noProof/>
             <w:webHidden/>
           </w:rPr>
-          <w:instrText xml:space="preserve"> PAGEREF _Toc242351058 \h </w:instrText>
+          <w:instrText xml:space="preserve"> PAGEREF _Toc242351078 \h </w:instrText>
         </w:r>
         <w:r>
           <w:rPr>
@@ -3115,7 +4541,81 @@
             <w:noProof/>
             <w:webHidden/>
           </w:rPr>
-          <w:t>11</w:t>
+          <w:t>15</w:t>
+        </w:r>
+        <w:r>
+          <w:rPr>
+            <w:noProof/>
+            <w:webHidden/>
+          </w:rPr>
+          <w:fldChar w:fldCharType="end"/>
+        </w:r>
+      </w:hyperlink>
+    </w:p>
+    <w:p>
+      <w:pPr>
+        <w:pStyle w:val="TOC3"/>
+        <w:tabs>
+          <w:tab w:val="right" w:leader="dot" w:pos="9736"/>
+        </w:tabs>
+        <w:rPr>
+          <w:rFonts w:asciiTheme="minorHAnsi" w:hAnsiTheme="minorHAnsi" w:cstheme="minorBidi"/>
+          <w:noProof/>
+          <w:color w:val="auto"/>
+          <w:kern w:val="2"/>
+          <w:sz w:val="24"/>
+          <w:szCs w:val="24"/>
+          <w14:ligatures w14:val="standardContextual"/>
+        </w:rPr>
+      </w:pPr>
+      <w:hyperlink w:anchor="_Toc242351079" w:history="1">
+        <w:r>
+          <w:rPr>
+            <w:rStyle w:val="Hyperlink"/>
+            <w:noProof/>
+          </w:rPr>
+          <w:t>Step 4</w:t>
+        </w:r>
+        <w:r>
+          <w:rPr>
+            <w:noProof/>
+            <w:webHidden/>
+          </w:rPr>
+          <w:tab/>
+        </w:r>
+        <w:r>
+          <w:rPr>
+            <w:noProof/>
+            <w:webHidden/>
+          </w:rPr>
+          <w:fldChar w:fldCharType="begin"/>
+        </w:r>
+        <w:r>
+          <w:rPr>
+            <w:noProof/>
+            <w:webHidden/>
+          </w:rPr>
+          <w:instrText xml:space="preserve"> PAGEREF _Toc242351079 \h </w:instrText>
+        </w:r>
+        <w:r>
+          <w:rPr>
+            <w:noProof/>
+            <w:webHidden/>
+          </w:rPr>
+        </w:r>
+        <w:r>
+          <w:rPr>
+            <w:noProof/>
+            <w:webHidden/>
+          </w:rPr>
+          <w:fldChar w:fldCharType="separate"/>
+        </w:r>
+        <w:r>
+          <w:rPr>
+            <w:noProof/>
+            <w:webHidden/>
+          </w:rPr>
+          <w:t>15</w:t>
         </w:r>
         <w:r>
           <w:rPr>
@@ -3142,13 +4642,13 @@
           <w14:ligatures w14:val="standardContextual"/>
         </w:rPr>
       </w:pPr>
-      <w:hyperlink w:anchor="_Toc242351059" w:history="1">
+      <w:hyperlink w:anchor="_Toc242351080" w:history="1">
         <w:r>
           <w:rPr>
             <w:rStyle w:val="Hyperlink"/>
             <w:noProof/>
           </w:rPr>
-          <w:t>7. Reference Normalization</w:t>
+          <w:t>12. Audit Logging</w:t>
         </w:r>
         <w:r>
           <w:rPr>
@@ -3169,7 +4669,7 @@
             <w:noProof/>
             <w:webHidden/>
           </w:rPr>
-          <w:instrText xml:space="preserve"> PAGEREF _Toc242351059 \h </w:instrText>
+          <w:instrText xml:space="preserve"> PAGEREF _Toc242351080 \h </w:instrText>
         </w:r>
         <w:r>
           <w:rPr>
@@ -3189,7 +4689,7 @@
             <w:noProof/>
             <w:webHidden/>
           </w:rPr>
-          <w:t>12</w:t>
+          <w:t>15</w:t>
         </w:r>
         <w:r>
           <w:rPr>
@@ -3216,13 +4716,13 @@
           <w14:ligatures w14:val="standardContextual"/>
         </w:rPr>
       </w:pPr>
-      <w:hyperlink w:anchor="_Toc242351060" w:history="1">
+      <w:hyperlink w:anchor="_Toc242351081" w:history="1">
         <w:r>
           <w:rPr>
             <w:rStyle w:val="Hyperlink"/>
             <w:noProof/>
           </w:rPr>
-          <w:t>Examples</w:t>
+          <w:t>Audit Fields</w:t>
         </w:r>
         <w:r>
           <w:rPr>
@@ -3243,7 +4743,7 @@
             <w:noProof/>
             <w:webHidden/>
           </w:rPr>
-          <w:instrText xml:space="preserve"> PAGEREF _Toc242351060 \h </w:instrText>
+          <w:instrText xml:space="preserve"> PAGEREF _Toc242351081 \h </w:instrText>
         </w:r>
         <w:r>
           <w:rPr>
@@ -3263,7 +4763,81 @@
             <w:noProof/>
             <w:webHidden/>
           </w:rPr>
-          <w:t>12</w:t>
+          <w:t>16</w:t>
+        </w:r>
+        <w:r>
+          <w:rPr>
+            <w:noProof/>
+            <w:webHidden/>
+          </w:rPr>
+          <w:fldChar w:fldCharType="end"/>
+        </w:r>
+      </w:hyperlink>
+    </w:p>
+    <w:p>
+      <w:pPr>
+        <w:pStyle w:val="TOC1"/>
+        <w:tabs>
+          <w:tab w:val="right" w:leader="dot" w:pos="9736"/>
+        </w:tabs>
+        <w:rPr>
+          <w:rFonts w:asciiTheme="minorHAnsi" w:hAnsiTheme="minorHAnsi" w:cstheme="minorBidi"/>
+          <w:noProof/>
+          <w:color w:val="auto"/>
+          <w:kern w:val="2"/>
+          <w:sz w:val="24"/>
+          <w:szCs w:val="24"/>
+          <w14:ligatures w14:val="standardContextual"/>
+        </w:rPr>
+      </w:pPr>
+      <w:hyperlink w:anchor="_Toc242351082" w:history="1">
+        <w:r>
+          <w:rPr>
+            <w:rStyle w:val="Hyperlink"/>
+            <w:noProof/>
+          </w:rPr>
+          <w:t>13. Daily Report Functional Design</w:t>
+        </w:r>
+        <w:r>
+          <w:rPr>
+            <w:noProof/>
+            <w:webHidden/>
+          </w:rPr>
+          <w:tab/>
+        </w:r>
+        <w:r>
+          <w:rPr>
+            <w:noProof/>
+            <w:webHidden/>
+          </w:rPr>
+          <w:fldChar w:fldCharType="begin"/>
+        </w:r>
+        <w:r>
+          <w:rPr>
+            <w:noProof/>
+            <w:webHidden/>
+          </w:rPr>
+          <w:instrText xml:space="preserve"> PAGEREF _Toc242351082 \h </w:instrText>
+        </w:r>
+        <w:r>
+          <w:rPr>
+            <w:noProof/>
+            <w:webHidden/>
+          </w:rPr>
+        </w:r>
+        <w:r>
+          <w:rPr>
+            <w:noProof/>
+            <w:webHidden/>
+          </w:rPr>
+          <w:fldChar w:fldCharType="separate"/>
+        </w:r>
+        <w:r>
+          <w:rPr>
+            <w:noProof/>
+            <w:webHidden/>
+          </w:rPr>
+          <w:t>16</w:t>
         </w:r>
         <w:r>
           <w:rPr>
@@ -3290,13 +4864,13 @@
           <w14:ligatures w14:val="standardContextual"/>
         </w:rPr>
       </w:pPr>
-      <w:hyperlink w:anchor="_Toc242351061" w:history="1">
+      <w:hyperlink w:anchor="_Toc242351083" w:history="1">
         <w:r>
           <w:rPr>
             <w:rStyle w:val="Hyperlink"/>
             <w:noProof/>
           </w:rPr>
-          <w:t>Normalization Rules</w:t>
+          <w:t>Report Schedule</w:t>
         </w:r>
         <w:r>
           <w:rPr>
@@ -3317,7 +4891,7 @@
             <w:noProof/>
             <w:webHidden/>
           </w:rPr>
-          <w:instrText xml:space="preserve"> PAGEREF _Toc242351061 \h </w:instrText>
+          <w:instrText xml:space="preserve"> PAGEREF _Toc242351083 \h </w:instrText>
         </w:r>
         <w:r>
           <w:rPr>
@@ -3337,1043 +4911,7 @@
             <w:noProof/>
             <w:webHidden/>
           </w:rPr>
-          <w:t>12</w:t>
-        </w:r>
-        <w:r>
-          <w:rPr>
-            <w:noProof/>
-            <w:webHidden/>
-          </w:rPr>
-          <w:fldChar w:fldCharType="end"/>
-        </w:r>
-      </w:hyperlink>
-    </w:p>
-    <w:p>
-      <w:pPr>
-        <w:pStyle w:val="TOC1"/>
-        <w:tabs>
-          <w:tab w:val="right" w:leader="dot" w:pos="9736"/>
-        </w:tabs>
-        <w:rPr>
-          <w:rFonts w:asciiTheme="minorHAnsi" w:hAnsiTheme="minorHAnsi" w:cstheme="minorBidi"/>
-          <w:noProof/>
-          <w:color w:val="auto"/>
-          <w:kern w:val="2"/>
-          <w:sz w:val="24"/>
-          <w:szCs w:val="24"/>
-          <w14:ligatures w14:val="standardContextual"/>
-        </w:rPr>
-      </w:pPr>
-      <w:hyperlink w:anchor="_Toc242351062" w:history="1">
-        <w:r>
-          <w:rPr>
-            <w:rStyle w:val="Hyperlink"/>
-            <w:noProof/>
-          </w:rPr>
-          <w:t>8. Folder Structure</w:t>
-        </w:r>
-        <w:r>
-          <w:rPr>
-            <w:noProof/>
-            <w:webHidden/>
-          </w:rPr>
-          <w:tab/>
-        </w:r>
-        <w:r>
-          <w:rPr>
-            <w:noProof/>
-            <w:webHidden/>
-          </w:rPr>
-          <w:fldChar w:fldCharType="begin"/>
-        </w:r>
-        <w:r>
-          <w:rPr>
-            <w:noProof/>
-            <w:webHidden/>
-          </w:rPr>
-          <w:instrText xml:space="preserve"> PAGEREF _Toc242351062 \h </w:instrText>
-        </w:r>
-        <w:r>
-          <w:rPr>
-            <w:noProof/>
-            <w:webHidden/>
-          </w:rPr>
-        </w:r>
-        <w:r>
-          <w:rPr>
-            <w:noProof/>
-            <w:webHidden/>
-          </w:rPr>
-          <w:fldChar w:fldCharType="separate"/>
-        </w:r>
-        <w:r>
-          <w:rPr>
-            <w:noProof/>
-            <w:webHidden/>
-          </w:rPr>
-          <w:t>12</w:t>
-        </w:r>
-        <w:r>
-          <w:rPr>
-            <w:noProof/>
-            <w:webHidden/>
-          </w:rPr>
-          <w:fldChar w:fldCharType="end"/>
-        </w:r>
-      </w:hyperlink>
-    </w:p>
-    <w:p>
-      <w:pPr>
-        <w:pStyle w:val="TOC2"/>
-        <w:tabs>
-          <w:tab w:val="right" w:leader="dot" w:pos="9736"/>
-        </w:tabs>
-        <w:rPr>
-          <w:rFonts w:asciiTheme="minorHAnsi" w:hAnsiTheme="minorHAnsi" w:cstheme="minorBidi"/>
-          <w:noProof/>
-          <w:color w:val="auto"/>
-          <w:kern w:val="2"/>
-          <w:sz w:val="24"/>
-          <w:szCs w:val="24"/>
-          <w14:ligatures w14:val="standardContextual"/>
-        </w:rPr>
-      </w:pPr>
-      <w:hyperlink w:anchor="_Toc242351063" w:history="1">
-        <w:r>
-          <w:rPr>
-            <w:rStyle w:val="Hyperlink"/>
-            <w:noProof/>
-          </w:rPr>
-          <w:t>Expected Folder Architecture</w:t>
-        </w:r>
-        <w:r>
-          <w:rPr>
-            <w:noProof/>
-            <w:webHidden/>
-          </w:rPr>
-          <w:tab/>
-        </w:r>
-        <w:r>
-          <w:rPr>
-            <w:noProof/>
-            <w:webHidden/>
-          </w:rPr>
-          <w:fldChar w:fldCharType="begin"/>
-        </w:r>
-        <w:r>
-          <w:rPr>
-            <w:noProof/>
-            <w:webHidden/>
-          </w:rPr>
-          <w:instrText xml:space="preserve"> PAGEREF _Toc242351063 \h </w:instrText>
-        </w:r>
-        <w:r>
-          <w:rPr>
-            <w:noProof/>
-            <w:webHidden/>
-          </w:rPr>
-        </w:r>
-        <w:r>
-          <w:rPr>
-            <w:noProof/>
-            <w:webHidden/>
-          </w:rPr>
-          <w:fldChar w:fldCharType="separate"/>
-        </w:r>
-        <w:r>
-          <w:rPr>
-            <w:noProof/>
-            <w:webHidden/>
-          </w:rPr>
-          <w:t>12</w:t>
-        </w:r>
-        <w:r>
-          <w:rPr>
-            <w:noProof/>
-            <w:webHidden/>
-          </w:rPr>
-          <w:fldChar w:fldCharType="end"/>
-        </w:r>
-      </w:hyperlink>
-    </w:p>
-    <w:p>
-      <w:pPr>
-        <w:pStyle w:val="TOC1"/>
-        <w:tabs>
-          <w:tab w:val="right" w:leader="dot" w:pos="9736"/>
-        </w:tabs>
-        <w:rPr>
-          <w:rFonts w:asciiTheme="minorHAnsi" w:hAnsiTheme="minorHAnsi" w:cstheme="minorBidi"/>
-          <w:noProof/>
-          <w:color w:val="auto"/>
-          <w:kern w:val="2"/>
-          <w:sz w:val="24"/>
-          <w:szCs w:val="24"/>
-          <w14:ligatures w14:val="standardContextual"/>
-        </w:rPr>
-      </w:pPr>
-      <w:hyperlink w:anchor="_Toc242351064" w:history="1">
-        <w:r>
-          <w:rPr>
-            <w:rStyle w:val="Hyperlink"/>
-            <w:noProof/>
-          </w:rPr>
-          <w:t>9. Automated Filing Rules</w:t>
-        </w:r>
-        <w:r>
-          <w:rPr>
-            <w:noProof/>
-            <w:webHidden/>
-          </w:rPr>
-          <w:tab/>
-        </w:r>
-        <w:r>
-          <w:rPr>
-            <w:noProof/>
-            <w:webHidden/>
-          </w:rPr>
-          <w:fldChar w:fldCharType="begin"/>
-        </w:r>
-        <w:r>
-          <w:rPr>
-            <w:noProof/>
-            <w:webHidden/>
-          </w:rPr>
-          <w:instrText xml:space="preserve"> PAGEREF _Toc242351064 \h </w:instrText>
-        </w:r>
-        <w:r>
-          <w:rPr>
-            <w:noProof/>
-            <w:webHidden/>
-          </w:rPr>
-        </w:r>
-        <w:r>
-          <w:rPr>
-            <w:noProof/>
-            <w:webHidden/>
-          </w:rPr>
-          <w:fldChar w:fldCharType="separate"/>
-        </w:r>
-        <w:r>
-          <w:rPr>
-            <w:noProof/>
-            <w:webHidden/>
-          </w:rPr>
-          <w:t>13</w:t>
-        </w:r>
-        <w:r>
-          <w:rPr>
-            <w:noProof/>
-            <w:webHidden/>
-          </w:rPr>
-          <w:fldChar w:fldCharType="end"/>
-        </w:r>
-      </w:hyperlink>
-    </w:p>
-    <w:p>
-      <w:pPr>
-        <w:pStyle w:val="TOC2"/>
-        <w:tabs>
-          <w:tab w:val="right" w:leader="dot" w:pos="9736"/>
-        </w:tabs>
-        <w:rPr>
-          <w:rFonts w:asciiTheme="minorHAnsi" w:hAnsiTheme="minorHAnsi" w:cstheme="minorBidi"/>
-          <w:noProof/>
-          <w:color w:val="auto"/>
-          <w:kern w:val="2"/>
-          <w:sz w:val="24"/>
-          <w:szCs w:val="24"/>
-          <w14:ligatures w14:val="standardContextual"/>
-        </w:rPr>
-      </w:pPr>
-      <w:hyperlink w:anchor="_Toc242351065" w:history="1">
-        <w:r>
-          <w:rPr>
-            <w:rStyle w:val="Hyperlink"/>
-            <w:noProof/>
-          </w:rPr>
-          <w:t>Rule 1 – Single Valid Family</w:t>
-        </w:r>
-        <w:r>
-          <w:rPr>
-            <w:noProof/>
-            <w:webHidden/>
-          </w:rPr>
-          <w:tab/>
-        </w:r>
-        <w:r>
-          <w:rPr>
-            <w:noProof/>
-            <w:webHidden/>
-          </w:rPr>
-          <w:fldChar w:fldCharType="begin"/>
-        </w:r>
-        <w:r>
-          <w:rPr>
-            <w:noProof/>
-            <w:webHidden/>
-          </w:rPr>
-          <w:instrText xml:space="preserve"> PAGEREF _Toc242351065 \h </w:instrText>
-        </w:r>
-        <w:r>
-          <w:rPr>
-            <w:noProof/>
-            <w:webHidden/>
-          </w:rPr>
-        </w:r>
-        <w:r>
-          <w:rPr>
-            <w:noProof/>
-            <w:webHidden/>
-          </w:rPr>
-          <w:fldChar w:fldCharType="separate"/>
-        </w:r>
-        <w:r>
-          <w:rPr>
-            <w:noProof/>
-            <w:webHidden/>
-          </w:rPr>
-          <w:t>13</w:t>
-        </w:r>
-        <w:r>
-          <w:rPr>
-            <w:noProof/>
-            <w:webHidden/>
-          </w:rPr>
-          <w:fldChar w:fldCharType="end"/>
-        </w:r>
-      </w:hyperlink>
-    </w:p>
-    <w:p>
-      <w:pPr>
-        <w:pStyle w:val="TOC2"/>
-        <w:tabs>
-          <w:tab w:val="right" w:leader="dot" w:pos="9736"/>
-        </w:tabs>
-        <w:rPr>
-          <w:rFonts w:asciiTheme="minorHAnsi" w:hAnsiTheme="minorHAnsi" w:cstheme="minorBidi"/>
-          <w:noProof/>
-          <w:color w:val="auto"/>
-          <w:kern w:val="2"/>
-          <w:sz w:val="24"/>
-          <w:szCs w:val="24"/>
-          <w14:ligatures w14:val="standardContextual"/>
-        </w:rPr>
-      </w:pPr>
-      <w:hyperlink w:anchor="_Toc242351066" w:history="1">
-        <w:r>
-          <w:rPr>
-            <w:rStyle w:val="Hyperlink"/>
-            <w:noProof/>
-          </w:rPr>
-          <w:t>Rule 2 – Folder Exists</w:t>
-        </w:r>
-        <w:r>
-          <w:rPr>
-            <w:noProof/>
-            <w:webHidden/>
-          </w:rPr>
-          <w:tab/>
-        </w:r>
-        <w:r>
-          <w:rPr>
-            <w:noProof/>
-            <w:webHidden/>
-          </w:rPr>
-          <w:fldChar w:fldCharType="begin"/>
-        </w:r>
-        <w:r>
-          <w:rPr>
-            <w:noProof/>
-            <w:webHidden/>
-          </w:rPr>
-          <w:instrText xml:space="preserve"> PAGEREF _Toc242351066 \h </w:instrText>
-        </w:r>
-        <w:r>
-          <w:rPr>
-            <w:noProof/>
-            <w:webHidden/>
-          </w:rPr>
-        </w:r>
-        <w:r>
-          <w:rPr>
-            <w:noProof/>
-            <w:webHidden/>
-          </w:rPr>
-          <w:fldChar w:fldCharType="separate"/>
-        </w:r>
-        <w:r>
-          <w:rPr>
-            <w:noProof/>
-            <w:webHidden/>
-          </w:rPr>
-          <w:t>13</w:t>
-        </w:r>
-        <w:r>
-          <w:rPr>
-            <w:noProof/>
-            <w:webHidden/>
-          </w:rPr>
-          <w:fldChar w:fldCharType="end"/>
-        </w:r>
-      </w:hyperlink>
-    </w:p>
-    <w:p>
-      <w:pPr>
-        <w:pStyle w:val="TOC2"/>
-        <w:tabs>
-          <w:tab w:val="right" w:leader="dot" w:pos="9736"/>
-        </w:tabs>
-        <w:rPr>
-          <w:rFonts w:asciiTheme="minorHAnsi" w:hAnsiTheme="minorHAnsi" w:cstheme="minorBidi"/>
-          <w:noProof/>
-          <w:color w:val="auto"/>
-          <w:kern w:val="2"/>
-          <w:sz w:val="24"/>
-          <w:szCs w:val="24"/>
-          <w14:ligatures w14:val="standardContextual"/>
-        </w:rPr>
-      </w:pPr>
-      <w:hyperlink w:anchor="_Toc242351067" w:history="1">
-        <w:r>
-          <w:rPr>
-            <w:rStyle w:val="Hyperlink"/>
-            <w:noProof/>
-          </w:rPr>
-          <w:t>Rule 3 – Folder Missing</w:t>
-        </w:r>
-        <w:r>
-          <w:rPr>
-            <w:noProof/>
-            <w:webHidden/>
-          </w:rPr>
-          <w:tab/>
-        </w:r>
-        <w:r>
-          <w:rPr>
-            <w:noProof/>
-            <w:webHidden/>
-          </w:rPr>
-          <w:fldChar w:fldCharType="begin"/>
-        </w:r>
-        <w:r>
-          <w:rPr>
-            <w:noProof/>
-            <w:webHidden/>
-          </w:rPr>
-          <w:instrText xml:space="preserve"> PAGEREF _Toc242351067 \h </w:instrText>
-        </w:r>
-        <w:r>
-          <w:rPr>
-            <w:noProof/>
-            <w:webHidden/>
-          </w:rPr>
-        </w:r>
-        <w:r>
-          <w:rPr>
-            <w:noProof/>
-            <w:webHidden/>
-          </w:rPr>
-          <w:fldChar w:fldCharType="separate"/>
-        </w:r>
-        <w:r>
-          <w:rPr>
-            <w:noProof/>
-            <w:webHidden/>
-          </w:rPr>
-          <w:t>13</w:t>
-        </w:r>
-        <w:r>
-          <w:rPr>
-            <w:noProof/>
-            <w:webHidden/>
-          </w:rPr>
-          <w:fldChar w:fldCharType="end"/>
-        </w:r>
-      </w:hyperlink>
-    </w:p>
-    <w:p>
-      <w:pPr>
-        <w:pStyle w:val="TOC1"/>
-        <w:tabs>
-          <w:tab w:val="right" w:leader="dot" w:pos="9736"/>
-        </w:tabs>
-        <w:rPr>
-          <w:rFonts w:asciiTheme="minorHAnsi" w:hAnsiTheme="minorHAnsi" w:cstheme="minorBidi"/>
-          <w:noProof/>
-          <w:color w:val="auto"/>
-          <w:kern w:val="2"/>
-          <w:sz w:val="24"/>
-          <w:szCs w:val="24"/>
-          <w14:ligatures w14:val="standardContextual"/>
-        </w:rPr>
-      </w:pPr>
-      <w:hyperlink w:anchor="_Toc242351068" w:history="1">
-        <w:r>
-          <w:rPr>
-            <w:rStyle w:val="Hyperlink"/>
-            <w:noProof/>
-          </w:rPr>
-          <w:t>10. Exception Rules</w:t>
-        </w:r>
-        <w:r>
-          <w:rPr>
-            <w:noProof/>
-            <w:webHidden/>
-          </w:rPr>
-          <w:tab/>
-        </w:r>
-        <w:r>
-          <w:rPr>
-            <w:noProof/>
-            <w:webHidden/>
-          </w:rPr>
-          <w:fldChar w:fldCharType="begin"/>
-        </w:r>
-        <w:r>
-          <w:rPr>
-            <w:noProof/>
-            <w:webHidden/>
-          </w:rPr>
-          <w:instrText xml:space="preserve"> PAGEREF _Toc242351068 \h </w:instrText>
-        </w:r>
-        <w:r>
-          <w:rPr>
-            <w:noProof/>
-            <w:webHidden/>
-          </w:rPr>
-        </w:r>
-        <w:r>
-          <w:rPr>
-            <w:noProof/>
-            <w:webHidden/>
-          </w:rPr>
-          <w:fldChar w:fldCharType="separate"/>
-        </w:r>
-        <w:r>
-          <w:rPr>
-            <w:noProof/>
-            <w:webHidden/>
-          </w:rPr>
-          <w:t>13</w:t>
-        </w:r>
-        <w:r>
-          <w:rPr>
-            <w:noProof/>
-            <w:webHidden/>
-          </w:rPr>
-          <w:fldChar w:fldCharType="end"/>
-        </w:r>
-      </w:hyperlink>
-    </w:p>
-    <w:p>
-      <w:pPr>
-        <w:pStyle w:val="TOC2"/>
-        <w:tabs>
-          <w:tab w:val="right" w:leader="dot" w:pos="9736"/>
-        </w:tabs>
-        <w:rPr>
-          <w:rFonts w:asciiTheme="minorHAnsi" w:hAnsiTheme="minorHAnsi" w:cstheme="minorBidi"/>
-          <w:noProof/>
-          <w:color w:val="auto"/>
-          <w:kern w:val="2"/>
-          <w:sz w:val="24"/>
-          <w:szCs w:val="24"/>
-          <w14:ligatures w14:val="standardContextual"/>
-        </w:rPr>
-      </w:pPr>
-      <w:hyperlink w:anchor="_Toc242351069" w:history="1">
-        <w:r>
-          <w:rPr>
-            <w:rStyle w:val="Hyperlink"/>
-            <w:noProof/>
-          </w:rPr>
-          <w:t>Exception 1 – No Reference Found</w:t>
-        </w:r>
-        <w:r>
-          <w:rPr>
-            <w:noProof/>
-            <w:webHidden/>
-          </w:rPr>
-          <w:tab/>
-        </w:r>
-        <w:r>
-          <w:rPr>
-            <w:noProof/>
-            <w:webHidden/>
-          </w:rPr>
-          <w:fldChar w:fldCharType="begin"/>
-        </w:r>
-        <w:r>
-          <w:rPr>
-            <w:noProof/>
-            <w:webHidden/>
-          </w:rPr>
-          <w:instrText xml:space="preserve"> PAGEREF _Toc242351069 \h </w:instrText>
-        </w:r>
-        <w:r>
-          <w:rPr>
-            <w:noProof/>
-            <w:webHidden/>
-          </w:rPr>
-        </w:r>
-        <w:r>
-          <w:rPr>
-            <w:noProof/>
-            <w:webHidden/>
-          </w:rPr>
-          <w:fldChar w:fldCharType="separate"/>
-        </w:r>
-        <w:r>
-          <w:rPr>
-            <w:noProof/>
-            <w:webHidden/>
-          </w:rPr>
-          <w:t>13</w:t>
-        </w:r>
-        <w:r>
-          <w:rPr>
-            <w:noProof/>
-            <w:webHidden/>
-          </w:rPr>
-          <w:fldChar w:fldCharType="end"/>
-        </w:r>
-      </w:hyperlink>
-    </w:p>
-    <w:p>
-      <w:pPr>
-        <w:pStyle w:val="TOC2"/>
-        <w:tabs>
-          <w:tab w:val="right" w:leader="dot" w:pos="9736"/>
-        </w:tabs>
-        <w:rPr>
-          <w:rFonts w:asciiTheme="minorHAnsi" w:hAnsiTheme="minorHAnsi" w:cstheme="minorBidi"/>
-          <w:noProof/>
-          <w:color w:val="auto"/>
-          <w:kern w:val="2"/>
-          <w:sz w:val="24"/>
-          <w:szCs w:val="24"/>
-          <w14:ligatures w14:val="standardContextual"/>
-        </w:rPr>
-      </w:pPr>
-      <w:hyperlink w:anchor="_Toc242351070" w:history="1">
-        <w:r>
-          <w:rPr>
-            <w:rStyle w:val="Hyperlink"/>
-            <w:noProof/>
-          </w:rPr>
-          <w:t>Exception 2 – Multiple Family References</w:t>
-        </w:r>
-        <w:r>
-          <w:rPr>
-            <w:noProof/>
-            <w:webHidden/>
-          </w:rPr>
-          <w:tab/>
-        </w:r>
-        <w:r>
-          <w:rPr>
-            <w:noProof/>
-            <w:webHidden/>
-          </w:rPr>
-          <w:fldChar w:fldCharType="begin"/>
-        </w:r>
-        <w:r>
-          <w:rPr>
-            <w:noProof/>
-            <w:webHidden/>
-          </w:rPr>
-          <w:instrText xml:space="preserve"> PAGEREF _Toc242351070 \h </w:instrText>
-        </w:r>
-        <w:r>
-          <w:rPr>
-            <w:noProof/>
-            <w:webHidden/>
-          </w:rPr>
-        </w:r>
-        <w:r>
-          <w:rPr>
-            <w:noProof/>
-            <w:webHidden/>
-          </w:rPr>
-          <w:fldChar w:fldCharType="separate"/>
-        </w:r>
-        <w:r>
-          <w:rPr>
-            <w:noProof/>
-            <w:webHidden/>
-          </w:rPr>
-          <w:t>14</w:t>
-        </w:r>
-        <w:r>
-          <w:rPr>
-            <w:noProof/>
-            <w:webHidden/>
-          </w:rPr>
-          <w:fldChar w:fldCharType="end"/>
-        </w:r>
-      </w:hyperlink>
-    </w:p>
-    <w:p>
-      <w:pPr>
-        <w:pStyle w:val="TOC2"/>
-        <w:tabs>
-          <w:tab w:val="right" w:leader="dot" w:pos="9736"/>
-        </w:tabs>
-        <w:rPr>
-          <w:rFonts w:asciiTheme="minorHAnsi" w:hAnsiTheme="minorHAnsi" w:cstheme="minorBidi"/>
-          <w:noProof/>
-          <w:color w:val="auto"/>
-          <w:kern w:val="2"/>
-          <w:sz w:val="24"/>
-          <w:szCs w:val="24"/>
-          <w14:ligatures w14:val="standardContextual"/>
-        </w:rPr>
-      </w:pPr>
-      <w:hyperlink w:anchor="_Toc242351071" w:history="1">
-        <w:r>
-          <w:rPr>
-            <w:rStyle w:val="Hyperlink"/>
-            <w:noProof/>
-          </w:rPr>
-          <w:t>Exception 3 – Subject/Body Conflict</w:t>
-        </w:r>
-        <w:r>
-          <w:rPr>
-            <w:noProof/>
-            <w:webHidden/>
-          </w:rPr>
-          <w:tab/>
-        </w:r>
-        <w:r>
-          <w:rPr>
-            <w:noProof/>
-            <w:webHidden/>
-          </w:rPr>
-          <w:fldChar w:fldCharType="begin"/>
-        </w:r>
-        <w:r>
-          <w:rPr>
-            <w:noProof/>
-            <w:webHidden/>
-          </w:rPr>
-          <w:instrText xml:space="preserve"> PAGEREF _Toc242351071 \h </w:instrText>
-        </w:r>
-        <w:r>
-          <w:rPr>
-            <w:noProof/>
-            <w:webHidden/>
-          </w:rPr>
-        </w:r>
-        <w:r>
-          <w:rPr>
-            <w:noProof/>
-            <w:webHidden/>
-          </w:rPr>
-          <w:fldChar w:fldCharType="separate"/>
-        </w:r>
-        <w:r>
-          <w:rPr>
-            <w:noProof/>
-            <w:webHidden/>
-          </w:rPr>
-          <w:t>14</w:t>
-        </w:r>
-        <w:r>
-          <w:rPr>
-            <w:noProof/>
-            <w:webHidden/>
-          </w:rPr>
-          <w:fldChar w:fldCharType="end"/>
-        </w:r>
-      </w:hyperlink>
-    </w:p>
-    <w:p>
-      <w:pPr>
-        <w:pStyle w:val="TOC2"/>
-        <w:tabs>
-          <w:tab w:val="right" w:leader="dot" w:pos="9736"/>
-        </w:tabs>
-        <w:rPr>
-          <w:rFonts w:asciiTheme="minorHAnsi" w:hAnsiTheme="minorHAnsi" w:cstheme="minorBidi"/>
-          <w:noProof/>
-          <w:color w:val="auto"/>
-          <w:kern w:val="2"/>
-          <w:sz w:val="24"/>
-          <w:szCs w:val="24"/>
-          <w14:ligatures w14:val="standardContextual"/>
-        </w:rPr>
-      </w:pPr>
-      <w:hyperlink w:anchor="_Toc242351072" w:history="1">
-        <w:r>
-          <w:rPr>
-            <w:rStyle w:val="Hyperlink"/>
-            <w:noProof/>
-          </w:rPr>
-          <w:t>Exception 4 – Conflicting References in Quoted History</w:t>
-        </w:r>
-        <w:r>
-          <w:rPr>
-            <w:noProof/>
-            <w:webHidden/>
-          </w:rPr>
-          <w:tab/>
-        </w:r>
-        <w:r>
-          <w:rPr>
-            <w:noProof/>
-            <w:webHidden/>
-          </w:rPr>
-          <w:fldChar w:fldCharType="begin"/>
-        </w:r>
-        <w:r>
-          <w:rPr>
-            <w:noProof/>
-            <w:webHidden/>
-          </w:rPr>
-          <w:instrText xml:space="preserve"> PAGEREF _Toc242351072 \h </w:instrText>
-        </w:r>
-        <w:r>
-          <w:rPr>
-            <w:noProof/>
-            <w:webHidden/>
-          </w:rPr>
-        </w:r>
-        <w:r>
-          <w:rPr>
-            <w:noProof/>
-            <w:webHidden/>
-          </w:rPr>
-          <w:fldChar w:fldCharType="separate"/>
-        </w:r>
-        <w:r>
-          <w:rPr>
-            <w:noProof/>
-            <w:webHidden/>
-          </w:rPr>
-          <w:t>14</w:t>
-        </w:r>
-        <w:r>
-          <w:rPr>
-            <w:noProof/>
-            <w:webHidden/>
-          </w:rPr>
-          <w:fldChar w:fldCharType="end"/>
-        </w:r>
-      </w:hyperlink>
-    </w:p>
-    <w:p>
-      <w:pPr>
-        <w:pStyle w:val="TOC2"/>
-        <w:tabs>
-          <w:tab w:val="right" w:leader="dot" w:pos="9736"/>
-        </w:tabs>
-        <w:rPr>
-          <w:rFonts w:asciiTheme="minorHAnsi" w:hAnsiTheme="minorHAnsi" w:cstheme="minorBidi"/>
-          <w:noProof/>
-          <w:color w:val="auto"/>
-          <w:kern w:val="2"/>
-          <w:sz w:val="24"/>
-          <w:szCs w:val="24"/>
-          <w14:ligatures w14:val="standardContextual"/>
-        </w:rPr>
-      </w:pPr>
-      <w:hyperlink w:anchor="_Toc242351073" w:history="1">
-        <w:r>
-          <w:rPr>
-            <w:rStyle w:val="Hyperlink"/>
-            <w:noProof/>
-          </w:rPr>
-          <w:t>Exception 5 – Folder Rule Validation Failure (Invalid Format)</w:t>
-        </w:r>
-        <w:r>
-          <w:rPr>
-            <w:noProof/>
-            <w:webHidden/>
-          </w:rPr>
-          <w:tab/>
-        </w:r>
-        <w:r>
-          <w:rPr>
-            <w:noProof/>
-            <w:webHidden/>
-          </w:rPr>
-          <w:fldChar w:fldCharType="begin"/>
-        </w:r>
-        <w:r>
-          <w:rPr>
-            <w:noProof/>
-            <w:webHidden/>
-          </w:rPr>
-          <w:instrText xml:space="preserve"> PAGEREF _Toc242351073 \h </w:instrText>
-        </w:r>
-        <w:r>
-          <w:rPr>
-            <w:noProof/>
-            <w:webHidden/>
-          </w:rPr>
-        </w:r>
-        <w:r>
-          <w:rPr>
-            <w:noProof/>
-            <w:webHidden/>
-          </w:rPr>
-          <w:fldChar w:fldCharType="separate"/>
-        </w:r>
-        <w:r>
-          <w:rPr>
-            <w:noProof/>
-            <w:webHidden/>
-          </w:rPr>
-          <w:t>14</w:t>
-        </w:r>
-        <w:r>
-          <w:rPr>
-            <w:noProof/>
-            <w:webHidden/>
-          </w:rPr>
-          <w:fldChar w:fldCharType="end"/>
-        </w:r>
-      </w:hyperlink>
-    </w:p>
-    <w:p>
-      <w:pPr>
-        <w:pStyle w:val="TOC2"/>
-        <w:tabs>
-          <w:tab w:val="right" w:leader="dot" w:pos="9736"/>
-        </w:tabs>
-        <w:rPr>
-          <w:rFonts w:asciiTheme="minorHAnsi" w:hAnsiTheme="minorHAnsi" w:cstheme="minorBidi"/>
-          <w:noProof/>
-          <w:color w:val="auto"/>
-          <w:kern w:val="2"/>
-          <w:sz w:val="24"/>
-          <w:szCs w:val="24"/>
-          <w14:ligatures w14:val="standardContextual"/>
-        </w:rPr>
-      </w:pPr>
-      <w:hyperlink w:anchor="_Toc242351074" w:history="1">
-        <w:r>
-          <w:rPr>
-            <w:rStyle w:val="Hyperlink"/>
-            <w:noProof/>
-          </w:rPr>
-          <w:t>Exception 6 – Attachment Only</w:t>
-        </w:r>
-        <w:r>
-          <w:rPr>
-            <w:noProof/>
-            <w:webHidden/>
-          </w:rPr>
-          <w:tab/>
-        </w:r>
-        <w:r>
-          <w:rPr>
-            <w:noProof/>
-            <w:webHidden/>
-          </w:rPr>
-          <w:fldChar w:fldCharType="begin"/>
-        </w:r>
-        <w:r>
-          <w:rPr>
-            <w:noProof/>
-            <w:webHidden/>
-          </w:rPr>
-          <w:instrText xml:space="preserve"> PAGEREF _Toc242351074 \h </w:instrText>
-        </w:r>
-        <w:r>
-          <w:rPr>
-            <w:noProof/>
-            <w:webHidden/>
-          </w:rPr>
-        </w:r>
-        <w:r>
-          <w:rPr>
-            <w:noProof/>
-            <w:webHidden/>
-          </w:rPr>
-          <w:fldChar w:fldCharType="separate"/>
-        </w:r>
-        <w:r>
-          <w:rPr>
-            <w:noProof/>
-            <w:webHidden/>
-          </w:rPr>
-          <w:t>15</w:t>
-        </w:r>
-        <w:r>
-          <w:rPr>
-            <w:noProof/>
-            <w:webHidden/>
-          </w:rPr>
-          <w:fldChar w:fldCharType="end"/>
-        </w:r>
-      </w:hyperlink>
-    </w:p>
-    <w:p>
-      <w:pPr>
-        <w:pStyle w:val="TOC1"/>
-        <w:tabs>
-          <w:tab w:val="right" w:leader="dot" w:pos="9736"/>
-        </w:tabs>
-        <w:rPr>
-          <w:rFonts w:asciiTheme="minorHAnsi" w:hAnsiTheme="minorHAnsi" w:cstheme="minorBidi"/>
-          <w:noProof/>
-          <w:color w:val="auto"/>
-          <w:kern w:val="2"/>
-          <w:sz w:val="24"/>
-          <w:szCs w:val="24"/>
-          <w14:ligatures w14:val="standardContextual"/>
-        </w:rPr>
-      </w:pPr>
-      <w:hyperlink w:anchor="_Toc242351075" w:history="1">
-        <w:r>
-          <w:rPr>
-            <w:rStyle w:val="Hyperlink"/>
-            <w:noProof/>
-          </w:rPr>
-          <w:t>11. Folder Creation Process</w:t>
-        </w:r>
-        <w:r>
-          <w:rPr>
-            <w:noProof/>
-            <w:webHidden/>
-          </w:rPr>
-          <w:tab/>
-        </w:r>
-        <w:r>
-          <w:rPr>
-            <w:noProof/>
-            <w:webHidden/>
-          </w:rPr>
-          <w:fldChar w:fldCharType="begin"/>
-        </w:r>
-        <w:r>
-          <w:rPr>
-            <w:noProof/>
-            <w:webHidden/>
-          </w:rPr>
-          <w:instrText xml:space="preserve"> PAGEREF _Toc242351075 \h </w:instrText>
-        </w:r>
-        <w:r>
-          <w:rPr>
-            <w:noProof/>
-            <w:webHidden/>
-          </w:rPr>
-        </w:r>
-        <w:r>
-          <w:rPr>
-            <w:noProof/>
-            <w:webHidden/>
-          </w:rPr>
-          <w:fldChar w:fldCharType="separate"/>
-        </w:r>
-        <w:r>
-          <w:rPr>
-            <w:noProof/>
-            <w:webHidden/>
-          </w:rPr>
-          <w:t>15</w:t>
+          <w:t>16</w:t>
         </w:r>
         <w:r>
           <w:rPr>
@@ -4400,13 +4938,13 @@
           <w14:ligatures w14:val="standardContextual"/>
         </w:rPr>
       </w:pPr>
-      <w:hyperlink w:anchor="_Toc242351076" w:history="1">
+      <w:hyperlink w:anchor="_Toc242351084" w:history="1">
         <w:r>
           <w:rPr>
             <w:rStyle w:val="Hyperlink"/>
             <w:noProof/>
           </w:rPr>
-          <w:t>Step 1</w:t>
+          <w:t>Executive Summary</w:t>
         </w:r>
         <w:r>
           <w:rPr>
@@ -4427,7 +4965,7 @@
             <w:noProof/>
             <w:webHidden/>
           </w:rPr>
-          <w:instrText xml:space="preserve"> PAGEREF _Toc242351076 \h </w:instrText>
+          <w:instrText xml:space="preserve"> PAGEREF _Toc242351084 \h </w:instrText>
         </w:r>
         <w:r>
           <w:rPr>
@@ -4447,7 +4985,7 @@
             <w:noProof/>
             <w:webHidden/>
           </w:rPr>
-          <w:t>15</w:t>
+          <w:t>16</w:t>
         </w:r>
         <w:r>
           <w:rPr>
@@ -4474,13 +5012,13 @@
           <w14:ligatures w14:val="standardContextual"/>
         </w:rPr>
       </w:pPr>
-      <w:hyperlink w:anchor="_Toc242351077" w:history="1">
+      <w:hyperlink w:anchor="_Toc242351085" w:history="1">
         <w:r>
           <w:rPr>
             <w:rStyle w:val="Hyperlink"/>
             <w:noProof/>
           </w:rPr>
-          <w:t>Step 2</w:t>
+          <w:t>New Folders Created</w:t>
         </w:r>
         <w:r>
           <w:rPr>
@@ -4501,7 +5039,7 @@
             <w:noProof/>
             <w:webHidden/>
           </w:rPr>
-          <w:instrText xml:space="preserve"> PAGEREF _Toc242351077 \h </w:instrText>
+          <w:instrText xml:space="preserve"> PAGEREF _Toc242351085 \h </w:instrText>
         </w:r>
         <w:r>
           <w:rPr>
@@ -4521,7 +5059,7 @@
             <w:noProof/>
             <w:webHidden/>
           </w:rPr>
-          <w:t>15</w:t>
+          <w:t>17</w:t>
         </w:r>
         <w:r>
           <w:rPr>
@@ -4548,13 +5086,13 @@
           <w14:ligatures w14:val="standardContextual"/>
         </w:rPr>
       </w:pPr>
-      <w:hyperlink w:anchor="_Toc242351078" w:history="1">
+      <w:hyperlink w:anchor="_Toc242351086" w:history="1">
         <w:r>
           <w:rPr>
             <w:rStyle w:val="Hyperlink"/>
             <w:noProof/>
           </w:rPr>
-          <w:t>Step 3</w:t>
+          <w:t>Filing Activity</w:t>
         </w:r>
         <w:r>
           <w:rPr>
@@ -4575,7 +5113,7 @@
             <w:noProof/>
             <w:webHidden/>
           </w:rPr>
-          <w:instrText xml:space="preserve"> PAGEREF _Toc242351078 \h </w:instrText>
+          <w:instrText xml:space="preserve"> PAGEREF _Toc242351086 \h </w:instrText>
         </w:r>
         <w:r>
           <w:rPr>
@@ -4595,7 +5133,7 @@
             <w:noProof/>
             <w:webHidden/>
           </w:rPr>
-          <w:t>15</w:t>
+          <w:t>17</w:t>
         </w:r>
         <w:r>
           <w:rPr>
@@ -4622,13 +5160,13 @@
           <w14:ligatures w14:val="standardContextual"/>
         </w:rPr>
       </w:pPr>
-      <w:hyperlink w:anchor="_Toc242351079" w:history="1">
+      <w:hyperlink w:anchor="_Toc242351087" w:history="1">
         <w:r>
           <w:rPr>
             <w:rStyle w:val="Hyperlink"/>
             <w:noProof/>
           </w:rPr>
-          <w:t>Step 4</w:t>
+          <w:t>Exceptions</w:t>
         </w:r>
         <w:r>
           <w:rPr>
@@ -4649,7 +5187,7 @@
             <w:noProof/>
             <w:webHidden/>
           </w:rPr>
-          <w:instrText xml:space="preserve"> PAGEREF _Toc242351079 \h </w:instrText>
+          <w:instrText xml:space="preserve"> PAGEREF _Toc242351087 \h </w:instrText>
         </w:r>
         <w:r>
           <w:rPr>
@@ -4669,303 +5207,7 @@
             <w:noProof/>
             <w:webHidden/>
           </w:rPr>
-          <w:t>15</w:t>
-        </w:r>
-        <w:r>
-          <w:rPr>
-            <w:noProof/>
-            <w:webHidden/>
-          </w:rPr>
-          <w:fldChar w:fldCharType="end"/>
-        </w:r>
-      </w:hyperlink>
-    </w:p>
-    <w:p>
-      <w:pPr>
-        <w:pStyle w:val="TOC1"/>
-        <w:tabs>
-          <w:tab w:val="right" w:leader="dot" w:pos="9736"/>
-        </w:tabs>
-        <w:rPr>
-          <w:rFonts w:asciiTheme="minorHAnsi" w:hAnsiTheme="minorHAnsi" w:cstheme="minorBidi"/>
-          <w:noProof/>
-          <w:color w:val="auto"/>
-          <w:kern w:val="2"/>
-          <w:sz w:val="24"/>
-          <w:szCs w:val="24"/>
-          <w14:ligatures w14:val="standardContextual"/>
-        </w:rPr>
-      </w:pPr>
-      <w:hyperlink w:anchor="_Toc242351080" w:history="1">
-        <w:r>
-          <w:rPr>
-            <w:rStyle w:val="Hyperlink"/>
-            <w:noProof/>
-          </w:rPr>
-          <w:t>12. Audit Logging</w:t>
-        </w:r>
-        <w:r>
-          <w:rPr>
-            <w:noProof/>
-            <w:webHidden/>
-          </w:rPr>
-          <w:tab/>
-        </w:r>
-        <w:r>
-          <w:rPr>
-            <w:noProof/>
-            <w:webHidden/>
-          </w:rPr>
-          <w:fldChar w:fldCharType="begin"/>
-        </w:r>
-        <w:r>
-          <w:rPr>
-            <w:noProof/>
-            <w:webHidden/>
-          </w:rPr>
-          <w:instrText xml:space="preserve"> PAGEREF _Toc242351080 \h </w:instrText>
-        </w:r>
-        <w:r>
-          <w:rPr>
-            <w:noProof/>
-            <w:webHidden/>
-          </w:rPr>
-        </w:r>
-        <w:r>
-          <w:rPr>
-            <w:noProof/>
-            <w:webHidden/>
-          </w:rPr>
-          <w:fldChar w:fldCharType="separate"/>
-        </w:r>
-        <w:r>
-          <w:rPr>
-            <w:noProof/>
-            <w:webHidden/>
-          </w:rPr>
-          <w:t>15</w:t>
-        </w:r>
-        <w:r>
-          <w:rPr>
-            <w:noProof/>
-            <w:webHidden/>
-          </w:rPr>
-          <w:fldChar w:fldCharType="end"/>
-        </w:r>
-      </w:hyperlink>
-    </w:p>
-    <w:p>
-      <w:pPr>
-        <w:pStyle w:val="TOC2"/>
-        <w:tabs>
-          <w:tab w:val="right" w:leader="dot" w:pos="9736"/>
-        </w:tabs>
-        <w:rPr>
-          <w:rFonts w:asciiTheme="minorHAnsi" w:hAnsiTheme="minorHAnsi" w:cstheme="minorBidi"/>
-          <w:noProof/>
-          <w:color w:val="auto"/>
-          <w:kern w:val="2"/>
-          <w:sz w:val="24"/>
-          <w:szCs w:val="24"/>
-          <w14:ligatures w14:val="standardContextual"/>
-        </w:rPr>
-      </w:pPr>
-      <w:hyperlink w:anchor="_Toc242351081" w:history="1">
-        <w:r>
-          <w:rPr>
-            <w:rStyle w:val="Hyperlink"/>
-            <w:noProof/>
-          </w:rPr>
-          <w:t>Audit Fields</w:t>
-        </w:r>
-        <w:r>
-          <w:rPr>
-            <w:noProof/>
-            <w:webHidden/>
-          </w:rPr>
-          <w:tab/>
-        </w:r>
-        <w:r>
-          <w:rPr>
-            <w:noProof/>
-            <w:webHidden/>
-          </w:rPr>
-          <w:fldChar w:fldCharType="begin"/>
-        </w:r>
-        <w:r>
-          <w:rPr>
-            <w:noProof/>
-            <w:webHidden/>
-          </w:rPr>
-          <w:instrText xml:space="preserve"> PAGEREF _Toc242351081 \h </w:instrText>
-        </w:r>
-        <w:r>
-          <w:rPr>
-            <w:noProof/>
-            <w:webHidden/>
-          </w:rPr>
-        </w:r>
-        <w:r>
-          <w:rPr>
-            <w:noProof/>
-            <w:webHidden/>
-          </w:rPr>
-          <w:fldChar w:fldCharType="separate"/>
-        </w:r>
-        <w:r>
-          <w:rPr>
-            <w:noProof/>
-            <w:webHidden/>
-          </w:rPr>
-          <w:t>16</w:t>
-        </w:r>
-        <w:r>
-          <w:rPr>
-            <w:noProof/>
-            <w:webHidden/>
-          </w:rPr>
-          <w:fldChar w:fldCharType="end"/>
-        </w:r>
-      </w:hyperlink>
-    </w:p>
-    <w:p>
-      <w:pPr>
-        <w:pStyle w:val="TOC1"/>
-        <w:tabs>
-          <w:tab w:val="right" w:leader="dot" w:pos="9736"/>
-        </w:tabs>
-        <w:rPr>
-          <w:rFonts w:asciiTheme="minorHAnsi" w:hAnsiTheme="minorHAnsi" w:cstheme="minorBidi"/>
-          <w:noProof/>
-          <w:color w:val="auto"/>
-          <w:kern w:val="2"/>
-          <w:sz w:val="24"/>
-          <w:szCs w:val="24"/>
-          <w14:ligatures w14:val="standardContextual"/>
-        </w:rPr>
-      </w:pPr>
-      <w:hyperlink w:anchor="_Toc242351082" w:history="1">
-        <w:r>
-          <w:rPr>
-            <w:rStyle w:val="Hyperlink"/>
-            <w:noProof/>
-          </w:rPr>
-          <w:t>13. Daily Report Functional Design</w:t>
-        </w:r>
-        <w:r>
-          <w:rPr>
-            <w:noProof/>
-            <w:webHidden/>
-          </w:rPr>
-          <w:tab/>
-        </w:r>
-        <w:r>
-          <w:rPr>
-            <w:noProof/>
-            <w:webHidden/>
-          </w:rPr>
-          <w:fldChar w:fldCharType="begin"/>
-        </w:r>
-        <w:r>
-          <w:rPr>
-            <w:noProof/>
-            <w:webHidden/>
-          </w:rPr>
-          <w:instrText xml:space="preserve"> PAGEREF _Toc242351082 \h </w:instrText>
-        </w:r>
-        <w:r>
-          <w:rPr>
-            <w:noProof/>
-            <w:webHidden/>
-          </w:rPr>
-        </w:r>
-        <w:r>
-          <w:rPr>
-            <w:noProof/>
-            <w:webHidden/>
-          </w:rPr>
-          <w:fldChar w:fldCharType="separate"/>
-        </w:r>
-        <w:r>
-          <w:rPr>
-            <w:noProof/>
-            <w:webHidden/>
-          </w:rPr>
-          <w:t>16</w:t>
-        </w:r>
-        <w:r>
-          <w:rPr>
-            <w:noProof/>
-            <w:webHidden/>
-          </w:rPr>
-          <w:fldChar w:fldCharType="end"/>
-        </w:r>
-      </w:hyperlink>
-    </w:p>
-    <w:p>
-      <w:pPr>
-        <w:pStyle w:val="TOC2"/>
-        <w:tabs>
-          <w:tab w:val="right" w:leader="dot" w:pos="9736"/>
-        </w:tabs>
-        <w:rPr>
-          <w:rFonts w:asciiTheme="minorHAnsi" w:hAnsiTheme="minorHAnsi" w:cstheme="minorBidi"/>
-          <w:noProof/>
-          <w:color w:val="auto"/>
-          <w:kern w:val="2"/>
-          <w:sz w:val="24"/>
-          <w:szCs w:val="24"/>
-          <w14:ligatures w14:val="standardContextual"/>
-        </w:rPr>
-      </w:pPr>
-      <w:hyperlink w:anchor="_Toc242351083" w:history="1">
-        <w:r>
-          <w:rPr>
-            <w:rStyle w:val="Hyperlink"/>
-            <w:noProof/>
-          </w:rPr>
-          <w:t>Report Schedule</w:t>
-        </w:r>
-        <w:r>
-          <w:rPr>
-            <w:noProof/>
-            <w:webHidden/>
-          </w:rPr>
-          <w:tab/>
-        </w:r>
-        <w:r>
-          <w:rPr>
-            <w:noProof/>
-            <w:webHidden/>
-          </w:rPr>
-          <w:fldChar w:fldCharType="begin"/>
-        </w:r>
-        <w:r>
-          <w:rPr>
-            <w:noProof/>
-            <w:webHidden/>
-          </w:rPr>
-          <w:instrText xml:space="preserve"> PAGEREF _Toc242351083 \h </w:instrText>
-        </w:r>
-        <w:r>
-          <w:rPr>
-            <w:noProof/>
-            <w:webHidden/>
-          </w:rPr>
-        </w:r>
-        <w:r>
-          <w:rPr>
-            <w:noProof/>
-            <w:webHidden/>
-          </w:rPr>
-          <w:fldChar w:fldCharType="separate"/>
-        </w:r>
-        <w:r>
-          <w:rPr>
-            <w:noProof/>
-            <w:webHidden/>
-          </w:rPr>
-          <w:t>16</w:t>
+          <w:t>17</w:t>
         </w:r>
         <w:r>
           <w:rPr>
@@ -4992,13 +5234,13 @@
           <w14:ligatures w14:val="standardContextual"/>
         </w:rPr>
       </w:pPr>
-      <w:hyperlink w:anchor="_Toc242351084" w:history="1">
+      <w:hyperlink w:anchor="_Toc242351088" w:history="1">
         <w:r>
           <w:rPr>
             <w:rStyle w:val="Hyperlink"/>
             <w:noProof/>
           </w:rPr>
-          <w:t>Executive Summary</w:t>
+          <w:t>Normalization Activity</w:t>
         </w:r>
         <w:r>
           <w:rPr>
@@ -5019,7 +5261,7 @@
             <w:noProof/>
             <w:webHidden/>
           </w:rPr>
-          <w:instrText xml:space="preserve"> PAGEREF _Toc242351084 \h </w:instrText>
+          <w:instrText xml:space="preserve"> PAGEREF _Toc242351088 \h </w:instrText>
         </w:r>
         <w:r>
           <w:rPr>
@@ -5039,7 +5281,7 @@
             <w:noProof/>
             <w:webHidden/>
           </w:rPr>
-          <w:t>16</w:t>
+          <w:t>17</w:t>
         </w:r>
         <w:r>
           <w:rPr>
@@ -5053,298 +5295,12 @@
     <w:p>
       <w:pPr>
         <w:pStyle w:val="TOC3"/>
-        <w:tabs>
-          <w:tab w:val="right" w:leader="dot" w:pos="9736"/>
-        </w:tabs>
-        <w:rPr>
-          <w:rFonts w:asciiTheme="minorHAnsi" w:hAnsiTheme="minorHAnsi" w:cstheme="minorBidi"/>
-          <w:noProof/>
-          <w:color w:val="auto"/>
-          <w:kern w:val="2"/>
-          <w:sz w:val="24"/>
-          <w:szCs w:val="24"/>
-          <w14:ligatures w14:val="standardContextual"/>
-        </w:rPr>
-      </w:pPr>
-      <w:hyperlink w:anchor="_Toc242351085" w:history="1">
-        <w:r>
-          <w:rPr>
-            <w:rStyle w:val="Hyperlink"/>
-            <w:noProof/>
-          </w:rPr>
-          <w:t>New Folders Created</w:t>
-        </w:r>
-        <w:r>
-          <w:rPr>
-            <w:noProof/>
-            <w:webHidden/>
-          </w:rPr>
-          <w:tab/>
-        </w:r>
-        <w:r>
-          <w:rPr>
-            <w:noProof/>
-            <w:webHidden/>
-          </w:rPr>
-          <w:fldChar w:fldCharType="begin"/>
-        </w:r>
-        <w:r>
-          <w:rPr>
-            <w:noProof/>
-            <w:webHidden/>
-          </w:rPr>
-          <w:instrText xml:space="preserve"> PAGEREF _Toc242351085 \h </w:instrText>
-        </w:r>
-        <w:r>
-          <w:rPr>
-            <w:noProof/>
-            <w:webHidden/>
-          </w:rPr>
-        </w:r>
-        <w:r>
-          <w:rPr>
-            <w:noProof/>
-            <w:webHidden/>
-          </w:rPr>
-          <w:fldChar w:fldCharType="separate"/>
-        </w:r>
-        <w:r>
-          <w:rPr>
-            <w:noProof/>
-            <w:webHidden/>
-          </w:rPr>
-          <w:t>17</w:t>
-        </w:r>
-        <w:r>
-          <w:rPr>
-            <w:noProof/>
-            <w:webHidden/>
-          </w:rPr>
-          <w:fldChar w:fldCharType="end"/>
-        </w:r>
-      </w:hyperlink>
-    </w:p>
-    <w:p>
-      <w:pPr>
-        <w:pStyle w:val="TOC3"/>
-        <w:tabs>
-          <w:tab w:val="right" w:leader="dot" w:pos="9736"/>
-        </w:tabs>
-        <w:rPr>
-          <w:rFonts w:asciiTheme="minorHAnsi" w:hAnsiTheme="minorHAnsi" w:cstheme="minorBidi"/>
-          <w:noProof/>
-          <w:color w:val="auto"/>
-          <w:kern w:val="2"/>
-          <w:sz w:val="24"/>
-          <w:szCs w:val="24"/>
-          <w14:ligatures w14:val="standardContextual"/>
-        </w:rPr>
-      </w:pPr>
-      <w:hyperlink w:anchor="_Toc242351086" w:history="1">
-        <w:r>
-          <w:rPr>
-            <w:rStyle w:val="Hyperlink"/>
-            <w:noProof/>
-          </w:rPr>
-          <w:t>Filing Activity</w:t>
-        </w:r>
-        <w:r>
-          <w:rPr>
-            <w:noProof/>
-            <w:webHidden/>
-          </w:rPr>
-          <w:tab/>
-        </w:r>
-        <w:r>
-          <w:rPr>
-            <w:noProof/>
-            <w:webHidden/>
-          </w:rPr>
-          <w:fldChar w:fldCharType="begin"/>
-        </w:r>
-        <w:r>
-          <w:rPr>
-            <w:noProof/>
-            <w:webHidden/>
-          </w:rPr>
-          <w:instrText xml:space="preserve"> PAGEREF _Toc242351086 \h </w:instrText>
-        </w:r>
-        <w:r>
-          <w:rPr>
-            <w:noProof/>
-            <w:webHidden/>
-          </w:rPr>
-        </w:r>
-        <w:r>
-          <w:rPr>
-            <w:noProof/>
-            <w:webHidden/>
-          </w:rPr>
-          <w:fldChar w:fldCharType="separate"/>
-        </w:r>
-        <w:r>
-          <w:rPr>
-            <w:noProof/>
-            <w:webHidden/>
-          </w:rPr>
-          <w:t>17</w:t>
-        </w:r>
-        <w:r>
-          <w:rPr>
-            <w:noProof/>
-            <w:webHidden/>
-          </w:rPr>
-          <w:fldChar w:fldCharType="end"/>
-        </w:r>
-      </w:hyperlink>
-    </w:p>
-    <w:p>
-      <w:pPr>
-        <w:pStyle w:val="TOC3"/>
-        <w:tabs>
-          <w:tab w:val="right" w:leader="dot" w:pos="9736"/>
-        </w:tabs>
-        <w:rPr>
-          <w:rFonts w:asciiTheme="minorHAnsi" w:hAnsiTheme="minorHAnsi" w:cstheme="minorBidi"/>
-          <w:noProof/>
-          <w:color w:val="auto"/>
-          <w:kern w:val="2"/>
-          <w:sz w:val="24"/>
-          <w:szCs w:val="24"/>
-          <w14:ligatures w14:val="standardContextual"/>
-        </w:rPr>
-      </w:pPr>
-      <w:hyperlink w:anchor="_Toc242351087" w:history="1">
-        <w:r>
-          <w:rPr>
-            <w:rStyle w:val="Hyperlink"/>
-            <w:noProof/>
-          </w:rPr>
-          <w:t>Exceptions</w:t>
-        </w:r>
-        <w:r>
-          <w:rPr>
-            <w:noProof/>
-            <w:webHidden/>
-          </w:rPr>
-          <w:tab/>
-        </w:r>
-        <w:r>
-          <w:rPr>
-            <w:noProof/>
-            <w:webHidden/>
-          </w:rPr>
-          <w:fldChar w:fldCharType="begin"/>
-        </w:r>
-        <w:r>
-          <w:rPr>
-            <w:noProof/>
-            <w:webHidden/>
-          </w:rPr>
-          <w:instrText xml:space="preserve"> PAGEREF _Toc242351087 \h </w:instrText>
-        </w:r>
-        <w:r>
-          <w:rPr>
-            <w:noProof/>
-            <w:webHidden/>
-          </w:rPr>
-        </w:r>
-        <w:r>
-          <w:rPr>
-            <w:noProof/>
-            <w:webHidden/>
-          </w:rPr>
-          <w:fldChar w:fldCharType="separate"/>
-        </w:r>
-        <w:r>
-          <w:rPr>
-            <w:noProof/>
-            <w:webHidden/>
-          </w:rPr>
-          <w:t>17</w:t>
-        </w:r>
-        <w:r>
-          <w:rPr>
-            <w:noProof/>
-            <w:webHidden/>
-          </w:rPr>
-          <w:fldChar w:fldCharType="end"/>
-        </w:r>
-      </w:hyperlink>
-    </w:p>
-    <w:p>
-      <w:pPr>
-        <w:pStyle w:val="TOC3"/>
-        <w:tabs>
-          <w:tab w:val="right" w:leader="dot" w:pos="9736"/>
-        </w:tabs>
-        <w:rPr>
-          <w:rFonts w:asciiTheme="minorHAnsi" w:hAnsiTheme="minorHAnsi" w:cstheme="minorBidi"/>
-          <w:noProof/>
-          <w:color w:val="auto"/>
-          <w:kern w:val="2"/>
-          <w:sz w:val="24"/>
-          <w:szCs w:val="24"/>
-          <w14:ligatures w14:val="standardContextual"/>
-        </w:rPr>
-      </w:pPr>
-      <w:hyperlink w:anchor="_Toc242351088" w:history="1">
-        <w:r>
-          <w:rPr>
-            <w:rStyle w:val="Hyperlink"/>
-            <w:noProof/>
-          </w:rPr>
-          <w:t>Normalization Activity</w:t>
-        </w:r>
-        <w:r>
-          <w:rPr>
-            <w:noProof/>
-            <w:webHidden/>
-          </w:rPr>
-          <w:tab/>
-        </w:r>
-        <w:r>
-          <w:rPr>
-            <w:noProof/>
-            <w:webHidden/>
-          </w:rPr>
-          <w:fldChar w:fldCharType="begin"/>
-        </w:r>
-        <w:r>
-          <w:rPr>
-            <w:noProof/>
-            <w:webHidden/>
-          </w:rPr>
-          <w:instrText xml:space="preserve"> PAGEREF _Toc242351088 \h </w:instrText>
-        </w:r>
-        <w:r>
-          <w:rPr>
-            <w:noProof/>
-            <w:webHidden/>
-          </w:rPr>
-        </w:r>
-        <w:r>
-          <w:rPr>
-            <w:noProof/>
-            <w:webHidden/>
-          </w:rPr>
-          <w:fldChar w:fldCharType="separate"/>
-        </w:r>
-        <w:r>
-          <w:rPr>
-            <w:noProof/>
-            <w:webHidden/>
-          </w:rPr>
-          <w:t>17</w:t>
-        </w:r>
-        <w:r>
-          <w:rPr>
-            <w:noProof/>
-            <w:webHidden/>
-          </w:rPr>
-          <w:fldChar w:fldCharType="end"/>
-        </w:r>
-      </w:hyperlink>
+      </w:pPr>
+      <w:r>
+        <w:t>Email Template Mock — Per-Email Status</w:t>
+        <w:tab/>
+        <w:t>17</w:t>
+      </w:r>
     </w:p>
     <w:p>
       <w:pPr>
@@ -6878,27 +6834,8 @@
             <w:tcW w:w="4873" w:type="dxa"/>
           </w:tcPr>
           <w:p>
-            <w:pPr>
-              <w:cnfStyle w:val="000000010000" w:firstRow="0" w:lastRow="0" w:firstColumn="0" w:lastColumn="0" w:oddVBand="0" w:evenVBand="0" w:oddHBand="0" w:evenHBand="1" w:firstRowFirstColumn="0" w:firstRowLastColumn="0" w:lastRowFirstColumn="0" w:lastRowLastColumn="0"/>
-            </w:pPr>
-            <w:r>
-              <w:t xml:space="preserve">The agent shall support the current known matter prefixes </w:t>
-            </w:r>
-            <w:commentRangeStart w:id="19"/>
-            <w:r>
-              <w:t>(VPI, ALP, EXO, MOD, SEM, VIA, VMN</w:t>
-            </w:r>
-            <w:commentRangeEnd w:id="19"/>
-            <w:r>
-              <w:rPr>
-                <w:rStyle w:val="CommentReference"/>
-                <w:sz w:val="21"/>
-                <w:szCs w:val="22"/>
-              </w:rPr>
-              <w:commentReference w:id="19"/>
-            </w:r>
-            <w:r>
-              <w:t>), subject to confirmation with Vertex IP Operations; new prefixes require a change request.</w:t>
+            <w:r>
+              <w:t>The agent shall support the current known matter prefixes, to be confirmed with Vertex IP Operations prior to go-live; new prefixes require a change request.</w:t>
             </w:r>
           </w:p>
         </w:tc>
@@ -7319,6 +7256,28 @@
           </w:p>
         </w:tc>
       </w:tr>
+      <w:tr>
+        <w:tc>
+          <w:tcPr>
+            <w:tcW w:type="dxa" w:w="4873"/>
+          </w:tcPr>
+          <w:p>
+            <w:r>
+              <w:t>FR-5.5</w:t>
+            </w:r>
+          </w:p>
+        </w:tc>
+        <w:tc>
+          <w:tcPr>
+            <w:tcW w:type="dxa" w:w="4873"/>
+          </w:tcPr>
+          <w:p>
+            <w:r>
+              <w:t>Prior to go-live, any existing Vertex family folders that do not currently use the VPI prefix shall undergo a one-time folder migration to rename them to the standard VPI-prefixed naming convention, so the agent can reliably match against them going forward.</w:t>
+            </w:r>
+          </w:p>
+        </w:tc>
+      </w:tr>
     </w:tbl>
     <w:p>
       <w:pPr>
@@ -7684,7 +7643,38 @@
           </w:p>
         </w:tc>
       </w:tr>
+      <w:tr>
+        <w:tc>
+          <w:tcPr>
+            <w:tcW w:type="dxa" w:w="4873"/>
+          </w:tcPr>
+          <w:p>
+            <w:r>
+              <w:t>FR-7.7</w:t>
+            </w:r>
+          </w:p>
+        </w:tc>
+        <w:tc>
+          <w:tcPr>
+            <w:tcW w:type="dxa" w:w="4873"/>
+          </w:tcPr>
+          <w:p>
+            <w:r>
+              <w:t>Technical failure (e.g., the email move/file action fails due to a system or connector error after a valid reference and folder were identified) → flag as a Technical Failure, distinct from a Business Exception, log the failure reason, route for operational remediation, and include in the daily report.</w:t>
+            </w:r>
+          </w:p>
+        </w:tc>
+      </w:tr>
     </w:tbl>
+    <w:p>
+      <w:r>
+        <w:rPr>
+          <w:b w:val="0"/>
+          <w:i/>
+        </w:rPr>
+        <w:t>FR-7.1–FR-7.5 and FR-7.6 above are classified as Business Exceptions (ambiguous or invalid business data — requires a human filing decision). FR-7.7 is classified as a Technical Failure (the business data was valid; the automation itself failed to execute). These two categories are reported separately — see FR-9.7.</w:t>
+      </w:r>
+    </w:p>
     <w:p>
       <w:pPr>
         <w:pStyle w:val="Heading2"/>
@@ -7755,11 +7745,8 @@
             <w:tcW w:w="4873" w:type="dxa"/>
           </w:tcPr>
           <w:p>
-            <w:pPr>
-              <w:cnfStyle w:val="000000100000" w:firstRow="0" w:lastRow="0" w:firstColumn="0" w:lastColumn="0" w:oddVBand="0" w:evenVBand="0" w:oddHBand="1" w:evenHBand="0" w:firstRowFirstColumn="0" w:firstRowLastColumn="0" w:lastRowFirstColumn="0" w:lastRowLastColumn="0"/>
-            </w:pPr>
-            <w:r>
-              <w:t>The agent shall generate an audit entry for every processed email, capturing: Message ID, Sender, Subject, Reference, Folder, Processing Result (Filed / Created Folder and Filed / Exception), Timestamp (UTC), and Exception Type (when applicable).</w:t>
+            <w:r>
+              <w:t>The agent shall generate an audit entry for every processed email, capturing: Message ID, Sender, Subject, Reference, Folder, Processing Result (Filed / Business Exception / Technical Failure), Timestamp (UTC), and Exception Type (when applicable).</w:t>
             </w:r>
           </w:p>
         </w:tc>
@@ -7988,6 +7975,28 @@
           </w:p>
         </w:tc>
       </w:tr>
+      <w:tr>
+        <w:tc>
+          <w:tcPr>
+            <w:tcW w:type="dxa" w:w="4873"/>
+          </w:tcPr>
+          <w:p>
+            <w:r>
+              <w:t>FR-9.7</w:t>
+            </w:r>
+          </w:p>
+        </w:tc>
+        <w:tc>
+          <w:tcPr>
+            <w:tcW w:type="dxa" w:w="4873"/>
+          </w:tcPr>
+          <w:p>
+            <w:r>
+              <w:t>For every processed email, the report shall show a consolidated Family Reference, Status, and Destination/Reason, where Status is one of Filed, Business Exception, or Technical Failure, so business owners can distinguish items needing a filing decision from items needing IT/system follow-up.</w:t>
+            </w:r>
+          </w:p>
+        </w:tc>
+      </w:tr>
     </w:tbl>
     <w:p>
       <w:pPr>
@@ -7998,175 +8007,6 @@
         <w:t>6. Reference Identification</w:t>
       </w:r>
       <w:bookmarkEnd w:id="27"/>
-    </w:p>
-    <w:p>
-      <w:pPr>
-        <w:pStyle w:val="Heading2"/>
-      </w:pPr>
-      <w:bookmarkStart w:id="28" w:name="_Toc242351054"/>
-      <w:r>
-        <w:t>Supported Family References</w:t>
-      </w:r>
-      <w:bookmarkEnd w:id="28"/>
-    </w:p>
-    <w:p>
-      <w:r>
-        <w:t xml:space="preserve">Examples include: </w:t>
-      </w:r>
-    </w:p>
-    <w:p>
-      <w:pPr>
-        <w:pStyle w:val="ListParagraph"/>
-        <w:numPr>
-          <w:ilvl w:val="0"/>
-          <w:numId w:val="10"/>
-        </w:numPr>
-      </w:pPr>
-      <w:r>
-        <w:t>VPI-18-114</w:t>
-      </w:r>
-    </w:p>
-    <w:p>
-      <w:pPr>
-        <w:pStyle w:val="ListParagraph"/>
-        <w:numPr>
-          <w:ilvl w:val="0"/>
-          <w:numId w:val="10"/>
-        </w:numPr>
-      </w:pPr>
-      <w:r>
-        <w:lastRenderedPageBreak/>
-        <w:t>ALP-25-001</w:t>
-      </w:r>
-    </w:p>
-    <w:p>
-      <w:pPr>
-        <w:pStyle w:val="ListParagraph"/>
-        <w:numPr>
-          <w:ilvl w:val="0"/>
-          <w:numId w:val="10"/>
-        </w:numPr>
-      </w:pPr>
-      <w:r>
-        <w:t>EXO-22-115</w:t>
-      </w:r>
-    </w:p>
-    <w:p>
-      <w:pPr>
-        <w:pStyle w:val="ListParagraph"/>
-        <w:numPr>
-          <w:ilvl w:val="0"/>
-          <w:numId w:val="10"/>
-        </w:numPr>
-      </w:pPr>
-      <w:r>
-        <w:t>MOD-24-220</w:t>
-      </w:r>
-    </w:p>
-    <w:p>
-      <w:pPr>
-        <w:pStyle w:val="ListParagraph"/>
-        <w:numPr>
-          <w:ilvl w:val="0"/>
-          <w:numId w:val="10"/>
-        </w:numPr>
-      </w:pPr>
-      <w:r>
-        <w:t>SEM-26-788</w:t>
-      </w:r>
-    </w:p>
-    <w:p>
-      <w:pPr>
-        <w:pStyle w:val="ListParagraph"/>
-        <w:numPr>
-          <w:ilvl w:val="0"/>
-          <w:numId w:val="10"/>
-        </w:numPr>
-      </w:pPr>
-      <w:r>
-        <w:t>VIA-05-201</w:t>
-      </w:r>
-    </w:p>
-    <w:p>
-      <w:pPr>
-        <w:pStyle w:val="ListParagraph"/>
-        <w:numPr>
-          <w:ilvl w:val="0"/>
-          <w:numId w:val="10"/>
-        </w:numPr>
-      </w:pPr>
-      <w:r>
-        <w:t>VMN-19-114</w:t>
-      </w:r>
-    </w:p>
-    <w:p>
-      <w:r>
-        <w:t>Based on current samples, the solution shall support the matter prefixes:</w:t>
-      </w:r>
-    </w:p>
-    <w:p>
-      <w:pPr>
-        <w:pStyle w:val="ListBullet"/>
-      </w:pPr>
-      <w:r>
-        <w:t>VPI</w:t>
-      </w:r>
-    </w:p>
-    <w:p>
-      <w:pPr>
-        <w:pStyle w:val="ListBullet"/>
-      </w:pPr>
-      <w:r>
-        <w:t>ALP</w:t>
-      </w:r>
-    </w:p>
-    <w:p>
-      <w:pPr>
-        <w:pStyle w:val="ListBullet"/>
-      </w:pPr>
-      <w:r>
-        <w:t>EXO</w:t>
-      </w:r>
-    </w:p>
-    <w:p>
-      <w:pPr>
-        <w:pStyle w:val="ListBullet"/>
-      </w:pPr>
-      <w:r>
-        <w:t>MOD</w:t>
-      </w:r>
-    </w:p>
-    <w:p>
-      <w:pPr>
-        <w:pStyle w:val="ListBullet"/>
-      </w:pPr>
-      <w:r>
-        <w:t>SEM</w:t>
-      </w:r>
-    </w:p>
-    <w:p>
-      <w:pPr>
-        <w:pStyle w:val="ListBullet"/>
-      </w:pPr>
-      <w:r>
-        <w:t>VIA</w:t>
-      </w:r>
-    </w:p>
-    <w:p>
-      <w:pPr>
-        <w:pStyle w:val="ListBullet"/>
-      </w:pPr>
-      <w:r>
-        <w:t>VMN</w:t>
-      </w:r>
-    </w:p>
-    <w:p>
-      <w:pPr>
-        <w:pStyle w:val="FDDCaption"/>
-      </w:pPr>
-      <w:r>
-        <w:t>Note: this prefix list reflects current samples. It should be confirmed with Vertex IP Operations as complete prior to go-live; any new prefixes will require a change request.</w:t>
-      </w:r>
     </w:p>
     <w:p>
       <w:pPr>
@@ -8836,6 +8676,19 @@
       </w:r>
     </w:p>
     <w:p>
+      <w:pPr>
+        <w:pStyle w:val="Heading3"/>
+      </w:pPr>
+      <w:r>
+        <w:t>One-Time Folder Migration</w:t>
+      </w:r>
+    </w:p>
+    <w:p>
+      <w:r>
+        <w:t>Some existing Vertex family folders do not currently carry the VPI prefix (e.g., a folder named “18-114” instead of “VPI-18-114”). Because the agent matches and files against the normalized, prefixed reference, these folders shall be renamed as a one-time migration performed prior to go-live. This is a manual/scripted pre-go-live activity, not an ongoing automated behavior (see Appendix — “Folder rename”).</w:t>
+      </w:r>
+    </w:p>
+    <w:p>
       <w:r>
         <w:t>Country-specific folders are ignored for routing purposes.</w:t>
       </w:r>
@@ -9881,6 +9734,80 @@
       </w:pPr>
       <w:r>
         <w:t>Create exception</w:t>
+      </w:r>
+    </w:p>
+    <w:p>
+      <w:pPr>
+        <w:pStyle w:val="Heading2"/>
+      </w:pPr>
+      <w:r>
+        <w:t>Exception 7 – Technical Failure</w:t>
+      </w:r>
+    </w:p>
+    <w:p>
+      <w:pPr>
+        <w:pStyle w:val="FDDLabel"/>
+      </w:pPr>
+      <w:r>
+        <w:t>Condition:</w:t>
+      </w:r>
+    </w:p>
+    <w:p>
+      <w:r>
+        <w:t>A valid reference and destination folder were identified, but the email move/file action failed due to a system or connector error (not a business data problem).</w:t>
+      </w:r>
+    </w:p>
+    <w:p>
+      <w:pPr>
+        <w:pStyle w:val="FDDLabel"/>
+      </w:pPr>
+      <w:r>
+        <w:t>Example:</w:t>
+      </w:r>
+    </w:p>
+    <w:p>
+      <w:r>
+        <w:t>VPI-18-114 identified correctly; the Outlook move action fails.</w:t>
+      </w:r>
+    </w:p>
+    <w:p>
+      <w:pPr>
+        <w:pStyle w:val="FDDLabel"/>
+      </w:pPr>
+      <w:r>
+        <w:t>Action:</w:t>
+      </w:r>
+    </w:p>
+    <w:p>
+      <w:pPr>
+        <w:pStyle w:val="ListBullet"/>
+      </w:pPr>
+      <w:r>
+        <w:t>Flag as Technical Failure (distinct from the Business Exceptions in Exceptions 1–6)</w:t>
+      </w:r>
+    </w:p>
+    <w:p>
+      <w:pPr>
+        <w:pStyle w:val="ListBullet"/>
+      </w:pPr>
+      <w:r>
+        <w:t>Log the failure reason</w:t>
+      </w:r>
+    </w:p>
+    <w:p>
+      <w:pPr>
+        <w:pStyle w:val="ListBullet"/>
+      </w:pPr>
+      <w:r>
+        <w:t>Route for operational/IT remediation</w:t>
+      </w:r>
+    </w:p>
+    <w:p>
+      <w:pPr>
+        <w:pStyle w:val="ListBullet"/>
+      </w:pPr>
+      <w:r>
+        <w:t>Include in daily report</w:t>
       </w:r>
     </w:p>
     <w:p>
@@ -10234,11 +10161,8 @@
             <w:tcW w:w="4873" w:type="dxa"/>
           </w:tcPr>
           <w:p>
-            <w:pPr>
-              <w:cnfStyle w:val="000000010000" w:firstRow="0" w:lastRow="0" w:firstColumn="0" w:lastColumn="0" w:oddVBand="0" w:evenVBand="0" w:oddHBand="0" w:evenHBand="1" w:firstRowFirstColumn="0" w:firstRowLastColumn="0" w:lastRowFirstColumn="0" w:lastRowLastColumn="0"/>
-            </w:pPr>
-            <w:r>
-              <w:t>Filed / Created Folder and Filed / Exception</w:t>
+            <w:r>
+              <w:t>Filed / Business Exception / Technical Failure</w:t>
             </w:r>
           </w:p>
         </w:tc>
@@ -10292,11 +10216,8 @@
             <w:tcW w:w="4873" w:type="dxa"/>
           </w:tcPr>
           <w:p>
-            <w:pPr>
-              <w:cnfStyle w:val="000000010000" w:firstRow="0" w:lastRow="0" w:firstColumn="0" w:lastColumn="0" w:oddVBand="0" w:evenVBand="0" w:oddHBand="0" w:evenHBand="1" w:firstRowFirstColumn="0" w:firstRowLastColumn="0" w:lastRowFirstColumn="0" w:lastRowLastColumn="0"/>
-            </w:pPr>
-            <w:r>
-              <w:t>Populated only when Processing Result = Exception (e.g., No Reference Found, Multiple References, Invalid Format)</w:t>
+            <w:r>
+              <w:t>Populated when Processing Result = Business Exception (e.g., No Reference Found, Multiple References, Invalid Format) or Technical Failure (e.g., Email Move Failed)</w:t>
             </w:r>
           </w:p>
         </w:tc>
@@ -11089,6 +11010,286 @@
     </w:p>
     <w:p>
       <w:pPr>
+        <w:pStyle w:val="Heading3"/>
+      </w:pPr>
+      <w:r>
+        <w:t>Email Template Mock — Per-Email Status</w:t>
+      </w:r>
+    </w:p>
+    <w:p>
+      <w:r>
+        <w:t>Per FR-9.7, the daily report email body includes a consolidated, per-email status table so business owners can see — at a glance — what was filed automatically, what needs a business filing decision, and what needs IT follow-up. Mock example:</w:t>
+      </w:r>
+    </w:p>
+    <w:tbl>
+      <w:tblPr>
+        <w:tblStyle w:val="LightGrid-Accent1"/>
+        <w:tblW w:type="auto" w:w="0"/>
+        <w:tblLook w:firstColumn="1" w:firstRow="1" w:lastColumn="0" w:lastRow="0" w:noHBand="0" w:noVBand="1" w:val="04A0"/>
+      </w:tblPr>
+      <w:tblGrid>
+        <w:gridCol w:w="2436"/>
+        <w:gridCol w:w="2436"/>
+        <w:gridCol w:w="2436"/>
+        <w:gridCol w:w="2436"/>
+      </w:tblGrid>
+      <w:tr>
+        <w:tc>
+          <w:tcPr>
+            <w:tcW w:type="dxa" w:w="2436"/>
+          </w:tcPr>
+          <w:p>
+            <w:r>
+              <w:rPr>
+                <w:b/>
+              </w:rPr>
+              <w:t>Email identifier</w:t>
+            </w:r>
+          </w:p>
+        </w:tc>
+        <w:tc>
+          <w:tcPr>
+            <w:tcW w:type="dxa" w:w="2436"/>
+          </w:tcPr>
+          <w:p>
+            <w:r>
+              <w:rPr>
+                <w:b/>
+              </w:rPr>
+              <w:t>Family reference</w:t>
+            </w:r>
+          </w:p>
+        </w:tc>
+        <w:tc>
+          <w:tcPr>
+            <w:tcW w:type="dxa" w:w="2436"/>
+          </w:tcPr>
+          <w:p>
+            <w:r>
+              <w:rPr>
+                <w:b/>
+              </w:rPr>
+              <w:t>Status</w:t>
+            </w:r>
+          </w:p>
+        </w:tc>
+        <w:tc>
+          <w:tcPr>
+            <w:tcW w:type="dxa" w:w="2436"/>
+          </w:tcPr>
+          <w:p>
+            <w:r>
+              <w:rPr>
+                <w:b/>
+              </w:rPr>
+              <w:t>Destination / reason</w:t>
+            </w:r>
+          </w:p>
+        </w:tc>
+      </w:tr>
+      <w:tr>
+        <w:tc>
+          <w:tcPr>
+            <w:tcW w:type="dxa" w:w="2436"/>
+          </w:tcPr>
+          <w:p>
+            <w:r>
+              <w:t>Email-001</w:t>
+            </w:r>
+          </w:p>
+        </w:tc>
+        <w:tc>
+          <w:tcPr>
+            <w:tcW w:type="dxa" w:w="2436"/>
+          </w:tcPr>
+          <w:p>
+            <w:r>
+              <w:t>SEM-25-786</w:t>
+            </w:r>
+          </w:p>
+        </w:tc>
+        <w:tc>
+          <w:tcPr>
+            <w:tcW w:type="dxa" w:w="2436"/>
+          </w:tcPr>
+          <w:p>
+            <w:r>
+              <w:t>Filed</w:t>
+            </w:r>
+          </w:p>
+        </w:tc>
+        <w:tc>
+          <w:tcPr>
+            <w:tcW w:type="dxa" w:w="2436"/>
+          </w:tcPr>
+          <w:p>
+            <w:r>
+              <w:t>Inbox/SEM-25-786</w:t>
+            </w:r>
+          </w:p>
+        </w:tc>
+      </w:tr>
+      <w:tr>
+        <w:tc>
+          <w:tcPr>
+            <w:tcW w:type="dxa" w:w="2436"/>
+          </w:tcPr>
+          <w:p>
+            <w:r>
+              <w:t>Email-002</w:t>
+            </w:r>
+          </w:p>
+        </w:tc>
+        <w:tc>
+          <w:tcPr>
+            <w:tcW w:type="dxa" w:w="2436"/>
+          </w:tcPr>
+          <w:p>
+            <w:r>
+              <w:t>—</w:t>
+            </w:r>
+          </w:p>
+        </w:tc>
+        <w:tc>
+          <w:tcPr>
+            <w:tcW w:type="dxa" w:w="2436"/>
+          </w:tcPr>
+          <w:p>
+            <w:r>
+              <w:t>Business Exception</w:t>
+            </w:r>
+          </w:p>
+        </w:tc>
+        <w:tc>
+          <w:tcPr>
+            <w:tcW w:type="dxa" w:w="2436"/>
+          </w:tcPr>
+          <w:p>
+            <w:r>
+              <w:t>No reference found; email left in Inbox</w:t>
+            </w:r>
+          </w:p>
+        </w:tc>
+      </w:tr>
+      <w:tr>
+        <w:tc>
+          <w:tcPr>
+            <w:tcW w:type="dxa" w:w="2436"/>
+          </w:tcPr>
+          <w:p>
+            <w:r>
+              <w:t>Email-003</w:t>
+            </w:r>
+          </w:p>
+        </w:tc>
+        <w:tc>
+          <w:tcPr>
+            <w:tcW w:type="dxa" w:w="2436"/>
+          </w:tcPr>
+          <w:p>
+            <w:r>
+              <w:t>—</w:t>
+            </w:r>
+          </w:p>
+        </w:tc>
+        <w:tc>
+          <w:tcPr>
+            <w:tcW w:type="dxa" w:w="2436"/>
+          </w:tcPr>
+          <w:p>
+            <w:r>
+              <w:t>Business Exception</w:t>
+            </w:r>
+          </w:p>
+        </w:tc>
+        <w:tc>
+          <w:tcPr>
+            <w:tcW w:type="dxa" w:w="2436"/>
+          </w:tcPr>
+          <w:p>
+            <w:r>
+              <w:t>Multiple family references found</w:t>
+            </w:r>
+          </w:p>
+        </w:tc>
+      </w:tr>
+      <w:tr>
+        <w:tc>
+          <w:tcPr>
+            <w:tcW w:type="dxa" w:w="2436"/>
+          </w:tcPr>
+          <w:p>
+            <w:r>
+              <w:t>Email-004</w:t>
+            </w:r>
+          </w:p>
+        </w:tc>
+        <w:tc>
+          <w:tcPr>
+            <w:tcW w:type="dxa" w:w="2436"/>
+          </w:tcPr>
+          <w:p>
+            <w:r>
+              <w:t>VPI-18-114</w:t>
+            </w:r>
+          </w:p>
+        </w:tc>
+        <w:tc>
+          <w:tcPr>
+            <w:tcW w:type="dxa" w:w="2436"/>
+          </w:tcPr>
+          <w:p>
+            <w:r>
+              <w:t>Technical Failure</w:t>
+            </w:r>
+          </w:p>
+        </w:tc>
+        <w:tc>
+          <w:tcPr>
+            <w:tcW w:type="dxa" w:w="2436"/>
+          </w:tcPr>
+          <w:p>
+            <w:r>
+              <w:t>Email move failed</w:t>
+            </w:r>
+          </w:p>
+        </w:tc>
+      </w:tr>
+    </w:tbl>
+    <w:p>
+      <w:pPr>
+        <w:pStyle w:val="ListBullet"/>
+      </w:pPr>
+      <w:r>
+        <w:t>Filed — the agent matched a valid reference, located (or created) the folder, and moved the email successfully. Destination/reason shows the resulting folder path.</w:t>
+      </w:r>
+    </w:p>
+    <w:p>
+      <w:pPr>
+        <w:pStyle w:val="ListBullet"/>
+      </w:pPr>
+      <w:r>
+        <w:t>Business Exception — the business data in the email was ambiguous or invalid (no reference found, multiple references, subject/body conflict, invalid format, or attachment-only). Destination/reason explains the ambiguity. Routed to Vertex IP Operations for a manual filing decision.</w:t>
+      </w:r>
+    </w:p>
+    <w:p>
+      <w:pPr>
+        <w:pStyle w:val="ListBullet"/>
+      </w:pPr>
+      <w:r>
+        <w:t>Technical Failure — the business data was valid, but the automation itself failed to execute the move (e.g., a connector/system error). Destination/reason names the failed action. Routed to IT/operations for remediation, not a business filing decision.</w:t>
+      </w:r>
+    </w:p>
+    <w:p>
+      <w:pPr>
+        <w:pStyle w:val="FDDCaption"/>
+      </w:pPr>
+      <w:r>
+        <w:t>Mock data shown for illustration; the production report is populated at runtime from the day's processed email activity.</w:t>
+      </w:r>
+    </w:p>
+    <w:p>
+      <w:pPr>
         <w:pStyle w:val="Heading1"/>
       </w:pPr>
       <w:bookmarkStart w:id="63" w:name="_Toc242351089"/>
@@ -11945,6 +12146,28 @@
                 <w:sz w:val="20"/>
               </w:rPr>
               <w:t>Do not rename automatically</w:t>
+            </w:r>
+          </w:p>
+        </w:tc>
+      </w:tr>
+      <w:tr>
+        <w:tc>
+          <w:tcPr>
+            <w:tcW w:type="dxa" w:w="4873"/>
+          </w:tcPr>
+          <w:p>
+            <w:r>
+              <w:t>Technical failure during filing</w:t>
+            </w:r>
+          </w:p>
+        </w:tc>
+        <w:tc>
+          <w:tcPr>
+            <w:tcW w:type="dxa" w:w="4873"/>
+          </w:tcPr>
+          <w:p>
+            <w:r>
+              <w:t>Flag as Technical Failure (not a Business Exception); route to IT for remediation</w:t>
             </w:r>
           </w:p>
         </w:tc>

</xml_diff>

<commit_message>
Simplify FDD Word doc email-template-mock section to match plain table
Co-authored-by: Copilot <223556219+Copilot@users.noreply.github.com>
</commit_message>
<xml_diff>
--- a/IPCorrespondence/Vertex IP FDD - Avanade Formatted.docx
+++ b/IPCorrespondence/Vertex IP FDD - Avanade Formatted.docx
@@ -11017,8 +11017,9 @@
       </w:r>
     </w:p>
     <w:p>
+      <w:r/>
       <w:r>
-        <w:t>Per FR-9.7, the daily report email body includes a consolidated, per-email status table so business owners can see — at a glance — what was filed automatically, what needs a business filing decision, and what needs IT follow-up. Mock example:</w:t>
+        <w:t>Simple table, one row per email. Status is one of Filed / Business Exception / Technical Failure:</w:t>
       </w:r>
     </w:p>
     <w:tbl>
@@ -11256,30 +11257,6 @@
         </w:tc>
       </w:tr>
     </w:tbl>
-    <w:p>
-      <w:pPr>
-        <w:pStyle w:val="ListBullet"/>
-      </w:pPr>
-      <w:r>
-        <w:t>Filed — the agent matched a valid reference, located (or created) the folder, and moved the email successfully. Destination/reason shows the resulting folder path.</w:t>
-      </w:r>
-    </w:p>
-    <w:p>
-      <w:pPr>
-        <w:pStyle w:val="ListBullet"/>
-      </w:pPr>
-      <w:r>
-        <w:t>Business Exception — the business data in the email was ambiguous or invalid (no reference found, multiple references, subject/body conflict, invalid format, or attachment-only). Destination/reason explains the ambiguity. Routed to Vertex IP Operations for a manual filing decision.</w:t>
-      </w:r>
-    </w:p>
-    <w:p>
-      <w:pPr>
-        <w:pStyle w:val="ListBullet"/>
-      </w:pPr>
-      <w:r>
-        <w:t>Technical Failure — the business data was valid, but the automation itself failed to execute the move (e.g., a connector/system error). Destination/reason names the failed action. Routed to IT/operations for remediation, not a business filing decision.</w:t>
-      </w:r>
-    </w:p>
     <w:p>
       <w:pPr>
         <w:pStyle w:val="FDDCaption"/>

</xml_diff>

<commit_message>
Add document versioning starting at v1.0
Co-authored-by: Copilot <223556219+Copilot@users.noreply.github.com>
</commit_message>
<xml_diff>
--- a/IPCorrespondence/Vertex IP FDD - Avanade Formatted.docx
+++ b/IPCorrespondence/Vertex IP FDD - Avanade Formatted.docx
@@ -313,7 +313,7 @@
               <w:rPr>
                 <w:sz w:val="20"/>
               </w:rPr>
-              <w:t>1.0 Draft</w:t>
+              <w:t>1.0</w:t>
             </w:r>
           </w:p>
         </w:tc>
@@ -405,7 +405,7 @@
               <w:rPr>
                 <w:sz w:val="20"/>
               </w:rPr>
-              <w:t>October 2026</w:t>
+              <w:t>October 13, 2026</w:t>
             </w:r>
           </w:p>
         </w:tc>
@@ -515,7 +515,7 @@
           </w:tcPr>
           <w:p>
             <w:r>
-              <w:t>1.0 Draft</w:t>
+              <w:t>1.0</w:t>
             </w:r>
           </w:p>
         </w:tc>
@@ -528,7 +528,7 @@
               <w:cnfStyle w:val="000000100000" w:firstRow="0" w:lastRow="0" w:firstColumn="0" w:lastColumn="0" w:oddVBand="0" w:evenVBand="0" w:oddHBand="1" w:evenHBand="0" w:firstRowFirstColumn="0" w:firstRowLastColumn="0" w:lastRowFirstColumn="0" w:lastRowLastColumn="0"/>
             </w:pPr>
             <w:r>
-              <w:t>October 2026</w:t>
+              <w:t>October 13, 2026</w:t>
             </w:r>
           </w:p>
         </w:tc>
@@ -554,7 +554,7 @@
               <w:cnfStyle w:val="000000100000" w:firstRow="0" w:lastRow="0" w:firstColumn="0" w:lastColumn="0" w:oddVBand="0" w:evenVBand="0" w:oddHBand="1" w:evenHBand="0" w:firstRowFirstColumn="0" w:firstRowLastColumn="0" w:lastRowFirstColumn="0" w:lastRowLastColumn="0"/>
             </w:pPr>
             <w:r>
-              <w:t>Initial draft issued for internal and stakeholder review</w:t>
+              <w:t>Initial baseline issued for internal and stakeholder review</w:t>
             </w:r>
           </w:p>
         </w:tc>

</xml_diff>